<commit_message>
Guia: demonstração cria 32 categorias (7 principais e 25 subcategorias)
Co-Authored-By: Claude Opus 5.5 <noreply@anthropic.com>
</commit_message>
<xml_diff>
--- a/docs/18-guia-de-instalacao-e-uso.docx
+++ b/docs/18-guia-de-instalacao-e-uso.docx
@@ -156,7 +156,7 @@
       <w:r>
         <w:fldChar w:fldCharType="separate"/>
       </w:r>
-      <w:hyperlink w:anchor="_Toc241393757" w:history="1">
+      <w:hyperlink w:anchor="_Toc241394084" w:history="1">
         <w:r>
           <w:rPr>
             <w:rStyle w:val="Hyperlink"/>
@@ -183,7 +183,7 @@
             <w:noProof/>
             <w:webHidden/>
           </w:rPr>
-          <w:instrText xml:space="preserve"> PAGEREF _Toc241393757 \h </w:instrText>
+          <w:instrText xml:space="preserve"> PAGEREF _Toc241394084 \h </w:instrText>
         </w:r>
         <w:r>
           <w:rPr>
@@ -224,7 +224,7 @@
           <w:noProof/>
         </w:rPr>
       </w:pPr>
-      <w:hyperlink w:anchor="_Toc241393758" w:history="1">
+      <w:hyperlink w:anchor="_Toc241394085" w:history="1">
         <w:r>
           <w:rPr>
             <w:rStyle w:val="Hyperlink"/>
@@ -251,7 +251,7 @@
             <w:noProof/>
             <w:webHidden/>
           </w:rPr>
-          <w:instrText xml:space="preserve"> PAGEREF _Toc241393758 \h </w:instrText>
+          <w:instrText xml:space="preserve"> PAGEREF _Toc241394085 \h </w:instrText>
         </w:r>
         <w:r>
           <w:rPr>
@@ -292,7 +292,7 @@
           <w:noProof/>
         </w:rPr>
       </w:pPr>
-      <w:hyperlink w:anchor="_Toc241393759" w:history="1">
+      <w:hyperlink w:anchor="_Toc241394086" w:history="1">
         <w:r>
           <w:rPr>
             <w:rStyle w:val="Hyperlink"/>
@@ -319,7 +319,7 @@
             <w:noProof/>
             <w:webHidden/>
           </w:rPr>
-          <w:instrText xml:space="preserve"> PAGEREF _Toc241393759 \h </w:instrText>
+          <w:instrText xml:space="preserve"> PAGEREF _Toc241394086 \h </w:instrText>
         </w:r>
         <w:r>
           <w:rPr>
@@ -360,7 +360,7 @@
           <w:noProof/>
         </w:rPr>
       </w:pPr>
-      <w:hyperlink w:anchor="_Toc241393760" w:history="1">
+      <w:hyperlink w:anchor="_Toc241394087" w:history="1">
         <w:r>
           <w:rPr>
             <w:rStyle w:val="Hyperlink"/>
@@ -387,7 +387,7 @@
             <w:noProof/>
             <w:webHidden/>
           </w:rPr>
-          <w:instrText xml:space="preserve"> PAGEREF _Toc241393760 \h </w:instrText>
+          <w:instrText xml:space="preserve"> PAGEREF _Toc241394087 \h </w:instrText>
         </w:r>
         <w:r>
           <w:rPr>
@@ -428,7 +428,7 @@
           <w:noProof/>
         </w:rPr>
       </w:pPr>
-      <w:hyperlink w:anchor="_Toc241393761" w:history="1">
+      <w:hyperlink w:anchor="_Toc241394088" w:history="1">
         <w:r>
           <w:rPr>
             <w:rStyle w:val="Hyperlink"/>
@@ -455,7 +455,7 @@
             <w:noProof/>
             <w:webHidden/>
           </w:rPr>
-          <w:instrText xml:space="preserve"> PAGEREF _Toc241393761 \h </w:instrText>
+          <w:instrText xml:space="preserve"> PAGEREF _Toc241394088 \h </w:instrText>
         </w:r>
         <w:r>
           <w:rPr>
@@ -496,7 +496,7 @@
           <w:noProof/>
         </w:rPr>
       </w:pPr>
-      <w:hyperlink w:anchor="_Toc241393762" w:history="1">
+      <w:hyperlink w:anchor="_Toc241394089" w:history="1">
         <w:r>
           <w:rPr>
             <w:rStyle w:val="Hyperlink"/>
@@ -531,7 +531,7 @@
             <w:noProof/>
             <w:webHidden/>
           </w:rPr>
-          <w:instrText xml:space="preserve"> PAGEREF _Toc241393762 \h </w:instrText>
+          <w:instrText xml:space="preserve"> PAGEREF _Toc241394089 \h </w:instrText>
         </w:r>
         <w:r>
           <w:rPr>
@@ -572,7 +572,7 @@
           <w:noProof/>
         </w:rPr>
       </w:pPr>
-      <w:hyperlink w:anchor="_Toc241393763" w:history="1">
+      <w:hyperlink w:anchor="_Toc241394090" w:history="1">
         <w:r>
           <w:rPr>
             <w:rStyle w:val="Hyperlink"/>
@@ -599,7 +599,7 @@
             <w:noProof/>
             <w:webHidden/>
           </w:rPr>
-          <w:instrText xml:space="preserve"> PAGEREF _Toc241393763 \h </w:instrText>
+          <w:instrText xml:space="preserve"> PAGEREF _Toc241394090 \h </w:instrText>
         </w:r>
         <w:r>
           <w:rPr>
@@ -640,7 +640,7 @@
           <w:noProof/>
         </w:rPr>
       </w:pPr>
-      <w:hyperlink w:anchor="_Toc241393764" w:history="1">
+      <w:hyperlink w:anchor="_Toc241394091" w:history="1">
         <w:r>
           <w:rPr>
             <w:rStyle w:val="Hyperlink"/>
@@ -667,7 +667,7 @@
             <w:noProof/>
             <w:webHidden/>
           </w:rPr>
-          <w:instrText xml:space="preserve"> PAGEREF _Toc241393764 \h </w:instrText>
+          <w:instrText xml:space="preserve"> PAGEREF _Toc241394091 \h </w:instrText>
         </w:r>
         <w:r>
           <w:rPr>
@@ -708,7 +708,7 @@
           <w:noProof/>
         </w:rPr>
       </w:pPr>
-      <w:hyperlink w:anchor="_Toc241393765" w:history="1">
+      <w:hyperlink w:anchor="_Toc241394092" w:history="1">
         <w:r>
           <w:rPr>
             <w:rStyle w:val="Hyperlink"/>
@@ -735,7 +735,7 @@
             <w:noProof/>
             <w:webHidden/>
           </w:rPr>
-          <w:instrText xml:space="preserve"> PAGEREF _Toc241393765 \h </w:instrText>
+          <w:instrText xml:space="preserve"> PAGEREF _Toc241394092 \h </w:instrText>
         </w:r>
         <w:r>
           <w:rPr>
@@ -776,7 +776,7 @@
           <w:noProof/>
         </w:rPr>
       </w:pPr>
-      <w:hyperlink w:anchor="_Toc241393766" w:history="1">
+      <w:hyperlink w:anchor="_Toc241394093" w:history="1">
         <w:r>
           <w:rPr>
             <w:rStyle w:val="Hyperlink"/>
@@ -803,7 +803,7 @@
             <w:noProof/>
             <w:webHidden/>
           </w:rPr>
-          <w:instrText xml:space="preserve"> PAGEREF _Toc241393766 \h </w:instrText>
+          <w:instrText xml:space="preserve"> PAGEREF _Toc241394093 \h </w:instrText>
         </w:r>
         <w:r>
           <w:rPr>
@@ -844,7 +844,7 @@
           <w:noProof/>
         </w:rPr>
       </w:pPr>
-      <w:hyperlink w:anchor="_Toc241393767" w:history="1">
+      <w:hyperlink w:anchor="_Toc241394094" w:history="1">
         <w:r>
           <w:rPr>
             <w:rStyle w:val="Hyperlink"/>
@@ -886,7 +886,7 @@
             <w:noProof/>
             <w:webHidden/>
           </w:rPr>
-          <w:instrText xml:space="preserve"> PAGEREF _Toc241393767 \h </w:instrText>
+          <w:instrText xml:space="preserve"> PAGEREF _Toc241394094 \h </w:instrText>
         </w:r>
         <w:r>
           <w:rPr>
@@ -927,7 +927,7 @@
           <w:noProof/>
         </w:rPr>
       </w:pPr>
-      <w:hyperlink w:anchor="_Toc241393768" w:history="1">
+      <w:hyperlink w:anchor="_Toc241394095" w:history="1">
         <w:r>
           <w:rPr>
             <w:rStyle w:val="Hyperlink"/>
@@ -969,7 +969,7 @@
             <w:noProof/>
             <w:webHidden/>
           </w:rPr>
-          <w:instrText xml:space="preserve"> PAGEREF _Toc241393768 \h </w:instrText>
+          <w:instrText xml:space="preserve"> PAGEREF _Toc241394095 \h </w:instrText>
         </w:r>
         <w:r>
           <w:rPr>
@@ -1010,7 +1010,7 @@
           <w:noProof/>
         </w:rPr>
       </w:pPr>
-      <w:hyperlink w:anchor="_Toc241393769" w:history="1">
+      <w:hyperlink w:anchor="_Toc241394096" w:history="1">
         <w:r>
           <w:rPr>
             <w:rStyle w:val="Hyperlink"/>
@@ -1037,7 +1037,7 @@
             <w:noProof/>
             <w:webHidden/>
           </w:rPr>
-          <w:instrText xml:space="preserve"> PAGEREF _Toc241393769 \h </w:instrText>
+          <w:instrText xml:space="preserve"> PAGEREF _Toc241394096 \h </w:instrText>
         </w:r>
         <w:r>
           <w:rPr>
@@ -1078,7 +1078,7 @@
           <w:noProof/>
         </w:rPr>
       </w:pPr>
-      <w:hyperlink w:anchor="_Toc241393770" w:history="1">
+      <w:hyperlink w:anchor="_Toc241394097" w:history="1">
         <w:r>
           <w:rPr>
             <w:rStyle w:val="Hyperlink"/>
@@ -1105,7 +1105,7 @@
             <w:noProof/>
             <w:webHidden/>
           </w:rPr>
-          <w:instrText xml:space="preserve"> PAGEREF _Toc241393770 \h </w:instrText>
+          <w:instrText xml:space="preserve"> PAGEREF _Toc241394097 \h </w:instrText>
         </w:r>
         <w:r>
           <w:rPr>
@@ -1146,7 +1146,7 @@
           <w:noProof/>
         </w:rPr>
       </w:pPr>
-      <w:hyperlink w:anchor="_Toc241393771" w:history="1">
+      <w:hyperlink w:anchor="_Toc241394098" w:history="1">
         <w:r>
           <w:rPr>
             <w:rStyle w:val="Hyperlink"/>
@@ -1173,7 +1173,7 @@
             <w:noProof/>
             <w:webHidden/>
           </w:rPr>
-          <w:instrText xml:space="preserve"> PAGEREF _Toc241393771 \h </w:instrText>
+          <w:instrText xml:space="preserve"> PAGEREF _Toc241394098 \h </w:instrText>
         </w:r>
         <w:r>
           <w:rPr>
@@ -1214,7 +1214,7 @@
           <w:noProof/>
         </w:rPr>
       </w:pPr>
-      <w:hyperlink w:anchor="_Toc241393772" w:history="1">
+      <w:hyperlink w:anchor="_Toc241394099" w:history="1">
         <w:r>
           <w:rPr>
             <w:rStyle w:val="Hyperlink"/>
@@ -1241,7 +1241,7 @@
             <w:noProof/>
             <w:webHidden/>
           </w:rPr>
-          <w:instrText xml:space="preserve"> PAGEREF _Toc241393772 \h </w:instrText>
+          <w:instrText xml:space="preserve"> PAGEREF _Toc241394099 \h </w:instrText>
         </w:r>
         <w:r>
           <w:rPr>
@@ -1282,7 +1282,7 @@
           <w:noProof/>
         </w:rPr>
       </w:pPr>
-      <w:hyperlink w:anchor="_Toc241393773" w:history="1">
+      <w:hyperlink w:anchor="_Toc241394100" w:history="1">
         <w:r>
           <w:rPr>
             <w:rStyle w:val="Hyperlink"/>
@@ -1309,7 +1309,7 @@
             <w:noProof/>
             <w:webHidden/>
           </w:rPr>
-          <w:instrText xml:space="preserve"> PAGEREF _Toc241393773 \h </w:instrText>
+          <w:instrText xml:space="preserve"> PAGEREF _Toc241394100 \h </w:instrText>
         </w:r>
         <w:r>
           <w:rPr>
@@ -1350,7 +1350,7 @@
           <w:noProof/>
         </w:rPr>
       </w:pPr>
-      <w:hyperlink w:anchor="_Toc241393774" w:history="1">
+      <w:hyperlink w:anchor="_Toc241394101" w:history="1">
         <w:r>
           <w:rPr>
             <w:rStyle w:val="Hyperlink"/>
@@ -1377,7 +1377,7 @@
             <w:noProof/>
             <w:webHidden/>
           </w:rPr>
-          <w:instrText xml:space="preserve"> PAGEREF _Toc241393774 \h </w:instrText>
+          <w:instrText xml:space="preserve"> PAGEREF _Toc241394101 \h </w:instrText>
         </w:r>
         <w:r>
           <w:rPr>
@@ -1418,7 +1418,7 @@
           <w:noProof/>
         </w:rPr>
       </w:pPr>
-      <w:hyperlink w:anchor="_Toc241393775" w:history="1">
+      <w:hyperlink w:anchor="_Toc241394102" w:history="1">
         <w:r>
           <w:rPr>
             <w:rStyle w:val="Hyperlink"/>
@@ -1445,7 +1445,7 @@
             <w:noProof/>
             <w:webHidden/>
           </w:rPr>
-          <w:instrText xml:space="preserve"> PAGEREF _Toc241393775 \h </w:instrText>
+          <w:instrText xml:space="preserve"> PAGEREF _Toc241394102 \h </w:instrText>
         </w:r>
         <w:r>
           <w:rPr>
@@ -1486,7 +1486,7 @@
           <w:noProof/>
         </w:rPr>
       </w:pPr>
-      <w:hyperlink w:anchor="_Toc241393776" w:history="1">
+      <w:hyperlink w:anchor="_Toc241394103" w:history="1">
         <w:r>
           <w:rPr>
             <w:rStyle w:val="Hyperlink"/>
@@ -1513,7 +1513,7 @@
             <w:noProof/>
             <w:webHidden/>
           </w:rPr>
-          <w:instrText xml:space="preserve"> PAGEREF _Toc241393776 \h </w:instrText>
+          <w:instrText xml:space="preserve"> PAGEREF _Toc241394103 \h </w:instrText>
         </w:r>
         <w:r>
           <w:rPr>
@@ -1554,7 +1554,7 @@
           <w:noProof/>
         </w:rPr>
       </w:pPr>
-      <w:hyperlink w:anchor="_Toc241393777" w:history="1">
+      <w:hyperlink w:anchor="_Toc241394104" w:history="1">
         <w:r>
           <w:rPr>
             <w:rStyle w:val="Hyperlink"/>
@@ -1581,7 +1581,7 @@
             <w:noProof/>
             <w:webHidden/>
           </w:rPr>
-          <w:instrText xml:space="preserve"> PAGEREF _Toc241393777 \h </w:instrText>
+          <w:instrText xml:space="preserve"> PAGEREF _Toc241394104 \h </w:instrText>
         </w:r>
         <w:r>
           <w:rPr>
@@ -1622,7 +1622,7 @@
           <w:noProof/>
         </w:rPr>
       </w:pPr>
-      <w:hyperlink w:anchor="_Toc241393778" w:history="1">
+      <w:hyperlink w:anchor="_Toc241394105" w:history="1">
         <w:r>
           <w:rPr>
             <w:rStyle w:val="Hyperlink"/>
@@ -1649,7 +1649,7 @@
             <w:noProof/>
             <w:webHidden/>
           </w:rPr>
-          <w:instrText xml:space="preserve"> PAGEREF _Toc241393778 \h </w:instrText>
+          <w:instrText xml:space="preserve"> PAGEREF _Toc241394105 \h </w:instrText>
         </w:r>
         <w:r>
           <w:rPr>
@@ -1690,7 +1690,7 @@
           <w:noProof/>
         </w:rPr>
       </w:pPr>
-      <w:hyperlink w:anchor="_Toc241393779" w:history="1">
+      <w:hyperlink w:anchor="_Toc241394106" w:history="1">
         <w:r>
           <w:rPr>
             <w:rStyle w:val="Hyperlink"/>
@@ -1717,7 +1717,7 @@
             <w:noProof/>
             <w:webHidden/>
           </w:rPr>
-          <w:instrText xml:space="preserve"> PAGEREF _Toc241393779 \h </w:instrText>
+          <w:instrText xml:space="preserve"> PAGEREF _Toc241394106 \h </w:instrText>
         </w:r>
         <w:r>
           <w:rPr>
@@ -1758,7 +1758,7 @@
           <w:noProof/>
         </w:rPr>
       </w:pPr>
-      <w:hyperlink w:anchor="_Toc241393780" w:history="1">
+      <w:hyperlink w:anchor="_Toc241394107" w:history="1">
         <w:r>
           <w:rPr>
             <w:rStyle w:val="Hyperlink"/>
@@ -1785,7 +1785,7 @@
             <w:noProof/>
             <w:webHidden/>
           </w:rPr>
-          <w:instrText xml:space="preserve"> PAGEREF _Toc241393780 \h </w:instrText>
+          <w:instrText xml:space="preserve"> PAGEREF _Toc241394107 \h </w:instrText>
         </w:r>
         <w:r>
           <w:rPr>
@@ -1826,7 +1826,7 @@
           <w:noProof/>
         </w:rPr>
       </w:pPr>
-      <w:hyperlink w:anchor="_Toc241393781" w:history="1">
+      <w:hyperlink w:anchor="_Toc241394108" w:history="1">
         <w:r>
           <w:rPr>
             <w:rStyle w:val="Hyperlink"/>
@@ -1853,7 +1853,7 @@
             <w:noProof/>
             <w:webHidden/>
           </w:rPr>
-          <w:instrText xml:space="preserve"> PAGEREF _Toc241393781 \h </w:instrText>
+          <w:instrText xml:space="preserve"> PAGEREF _Toc241394108 \h </w:instrText>
         </w:r>
         <w:r>
           <w:rPr>
@@ -1894,7 +1894,7 @@
           <w:noProof/>
         </w:rPr>
       </w:pPr>
-      <w:hyperlink w:anchor="_Toc241393782" w:history="1">
+      <w:hyperlink w:anchor="_Toc241394109" w:history="1">
         <w:r>
           <w:rPr>
             <w:rStyle w:val="Hyperlink"/>
@@ -1921,7 +1921,7 @@
             <w:noProof/>
             <w:webHidden/>
           </w:rPr>
-          <w:instrText xml:space="preserve"> PAGEREF _Toc241393782 \h </w:instrText>
+          <w:instrText xml:space="preserve"> PAGEREF _Toc241394109 \h </w:instrText>
         </w:r>
         <w:r>
           <w:rPr>
@@ -1962,7 +1962,7 @@
           <w:noProof/>
         </w:rPr>
       </w:pPr>
-      <w:hyperlink w:anchor="_Toc241393783" w:history="1">
+      <w:hyperlink w:anchor="_Toc241394110" w:history="1">
         <w:r>
           <w:rPr>
             <w:rStyle w:val="Hyperlink"/>
@@ -1989,7 +1989,7 @@
             <w:noProof/>
             <w:webHidden/>
           </w:rPr>
-          <w:instrText xml:space="preserve"> PAGEREF _Toc241393783 \h </w:instrText>
+          <w:instrText xml:space="preserve"> PAGEREF _Toc241394110 \h </w:instrText>
         </w:r>
         <w:r>
           <w:rPr>
@@ -2030,7 +2030,7 @@
           <w:noProof/>
         </w:rPr>
       </w:pPr>
-      <w:hyperlink w:anchor="_Toc241393784" w:history="1">
+      <w:hyperlink w:anchor="_Toc241394111" w:history="1">
         <w:r>
           <w:rPr>
             <w:rStyle w:val="Hyperlink"/>
@@ -2057,7 +2057,7 @@
             <w:noProof/>
             <w:webHidden/>
           </w:rPr>
-          <w:instrText xml:space="preserve"> PAGEREF _Toc241393784 \h </w:instrText>
+          <w:instrText xml:space="preserve"> PAGEREF _Toc241394111 \h </w:instrText>
         </w:r>
         <w:r>
           <w:rPr>
@@ -2098,7 +2098,7 @@
           <w:noProof/>
         </w:rPr>
       </w:pPr>
-      <w:hyperlink w:anchor="_Toc241393785" w:history="1">
+      <w:hyperlink w:anchor="_Toc241394112" w:history="1">
         <w:r>
           <w:rPr>
             <w:rStyle w:val="Hyperlink"/>
@@ -2125,7 +2125,7 @@
             <w:noProof/>
             <w:webHidden/>
           </w:rPr>
-          <w:instrText xml:space="preserve"> PAGEREF _Toc241393785 \h </w:instrText>
+          <w:instrText xml:space="preserve"> PAGEREF _Toc241394112 \h </w:instrText>
         </w:r>
         <w:r>
           <w:rPr>
@@ -2166,7 +2166,7 @@
           <w:noProof/>
         </w:rPr>
       </w:pPr>
-      <w:hyperlink w:anchor="_Toc241393786" w:history="1">
+      <w:hyperlink w:anchor="_Toc241394113" w:history="1">
         <w:r>
           <w:rPr>
             <w:rStyle w:val="Hyperlink"/>
@@ -2193,7 +2193,7 @@
             <w:noProof/>
             <w:webHidden/>
           </w:rPr>
-          <w:instrText xml:space="preserve"> PAGEREF _Toc241393786 \h </w:instrText>
+          <w:instrText xml:space="preserve"> PAGEREF _Toc241394113 \h </w:instrText>
         </w:r>
         <w:r>
           <w:rPr>
@@ -2234,7 +2234,7 @@
           <w:noProof/>
         </w:rPr>
       </w:pPr>
-      <w:hyperlink w:anchor="_Toc241393787" w:history="1">
+      <w:hyperlink w:anchor="_Toc241394114" w:history="1">
         <w:r>
           <w:rPr>
             <w:rStyle w:val="Hyperlink"/>
@@ -2261,7 +2261,7 @@
             <w:noProof/>
             <w:webHidden/>
           </w:rPr>
-          <w:instrText xml:space="preserve"> PAGEREF _Toc241393787 \h </w:instrText>
+          <w:instrText xml:space="preserve"> PAGEREF _Toc241394114 \h </w:instrText>
         </w:r>
         <w:r>
           <w:rPr>
@@ -2302,7 +2302,7 @@
           <w:noProof/>
         </w:rPr>
       </w:pPr>
-      <w:hyperlink w:anchor="_Toc241393788" w:history="1">
+      <w:hyperlink w:anchor="_Toc241394115" w:history="1">
         <w:r>
           <w:rPr>
             <w:rStyle w:val="Hyperlink"/>
@@ -2329,7 +2329,7 @@
             <w:noProof/>
             <w:webHidden/>
           </w:rPr>
-          <w:instrText xml:space="preserve"> PAGEREF _Toc241393788 \h </w:instrText>
+          <w:instrText xml:space="preserve"> PAGEREF _Toc241394115 \h </w:instrText>
         </w:r>
         <w:r>
           <w:rPr>
@@ -2370,7 +2370,7 @@
           <w:noProof/>
         </w:rPr>
       </w:pPr>
-      <w:hyperlink w:anchor="_Toc241393789" w:history="1">
+      <w:hyperlink w:anchor="_Toc241394116" w:history="1">
         <w:r>
           <w:rPr>
             <w:rStyle w:val="Hyperlink"/>
@@ -2397,7 +2397,7 @@
             <w:noProof/>
             <w:webHidden/>
           </w:rPr>
-          <w:instrText xml:space="preserve"> PAGEREF _Toc241393789 \h </w:instrText>
+          <w:instrText xml:space="preserve"> PAGEREF _Toc241394116 \h </w:instrText>
         </w:r>
         <w:r>
           <w:rPr>
@@ -2438,7 +2438,7 @@
           <w:noProof/>
         </w:rPr>
       </w:pPr>
-      <w:hyperlink w:anchor="_Toc241393790" w:history="1">
+      <w:hyperlink w:anchor="_Toc241394117" w:history="1">
         <w:r>
           <w:rPr>
             <w:rStyle w:val="Hyperlink"/>
@@ -2465,7 +2465,7 @@
             <w:noProof/>
             <w:webHidden/>
           </w:rPr>
-          <w:instrText xml:space="preserve"> PAGEREF _Toc241393790 \h </w:instrText>
+          <w:instrText xml:space="preserve"> PAGEREF _Toc241394117 \h </w:instrText>
         </w:r>
         <w:r>
           <w:rPr>
@@ -2506,7 +2506,7 @@
           <w:noProof/>
         </w:rPr>
       </w:pPr>
-      <w:hyperlink w:anchor="_Toc241393791" w:history="1">
+      <w:hyperlink w:anchor="_Toc241394118" w:history="1">
         <w:r>
           <w:rPr>
             <w:rStyle w:val="Hyperlink"/>
@@ -2533,7 +2533,7 @@
             <w:noProof/>
             <w:webHidden/>
           </w:rPr>
-          <w:instrText xml:space="preserve"> PAGEREF _Toc241393791 \h </w:instrText>
+          <w:instrText xml:space="preserve"> PAGEREF _Toc241394118 \h </w:instrText>
         </w:r>
         <w:r>
           <w:rPr>
@@ -2574,7 +2574,7 @@
           <w:noProof/>
         </w:rPr>
       </w:pPr>
-      <w:hyperlink w:anchor="_Toc241393792" w:history="1">
+      <w:hyperlink w:anchor="_Toc241394119" w:history="1">
         <w:r>
           <w:rPr>
             <w:rStyle w:val="Hyperlink"/>
@@ -2601,7 +2601,7 @@
             <w:noProof/>
             <w:webHidden/>
           </w:rPr>
-          <w:instrText xml:space="preserve"> PAGEREF _Toc241393792 \h </w:instrText>
+          <w:instrText xml:space="preserve"> PAGEREF _Toc241394119 \h </w:instrText>
         </w:r>
         <w:r>
           <w:rPr>
@@ -2642,7 +2642,7 @@
           <w:noProof/>
         </w:rPr>
       </w:pPr>
-      <w:hyperlink w:anchor="_Toc241393793" w:history="1">
+      <w:hyperlink w:anchor="_Toc241394120" w:history="1">
         <w:r>
           <w:rPr>
             <w:rStyle w:val="Hyperlink"/>
@@ -2669,7 +2669,7 @@
             <w:noProof/>
             <w:webHidden/>
           </w:rPr>
-          <w:instrText xml:space="preserve"> PAGEREF _Toc241393793 \h </w:instrText>
+          <w:instrText xml:space="preserve"> PAGEREF _Toc241394120 \h </w:instrText>
         </w:r>
         <w:r>
           <w:rPr>
@@ -2710,7 +2710,7 @@
           <w:noProof/>
         </w:rPr>
       </w:pPr>
-      <w:hyperlink w:anchor="_Toc241393794" w:history="1">
+      <w:hyperlink w:anchor="_Toc241394121" w:history="1">
         <w:r>
           <w:rPr>
             <w:rStyle w:val="Hyperlink"/>
@@ -2737,7 +2737,7 @@
             <w:noProof/>
             <w:webHidden/>
           </w:rPr>
-          <w:instrText xml:space="preserve"> PAGEREF _Toc241393794 \h </w:instrText>
+          <w:instrText xml:space="preserve"> PAGEREF _Toc241394121 \h </w:instrText>
         </w:r>
         <w:r>
           <w:rPr>
@@ -2778,7 +2778,7 @@
           <w:noProof/>
         </w:rPr>
       </w:pPr>
-      <w:hyperlink w:anchor="_Toc241393795" w:history="1">
+      <w:hyperlink w:anchor="_Toc241394122" w:history="1">
         <w:r>
           <w:rPr>
             <w:rStyle w:val="Hyperlink"/>
@@ -2805,7 +2805,7 @@
             <w:noProof/>
             <w:webHidden/>
           </w:rPr>
-          <w:instrText xml:space="preserve"> PAGEREF _Toc241393795 \h </w:instrText>
+          <w:instrText xml:space="preserve"> PAGEREF _Toc241394122 \h </w:instrText>
         </w:r>
         <w:r>
           <w:rPr>
@@ -2846,7 +2846,7 @@
           <w:noProof/>
         </w:rPr>
       </w:pPr>
-      <w:hyperlink w:anchor="_Toc241393796" w:history="1">
+      <w:hyperlink w:anchor="_Toc241394123" w:history="1">
         <w:r>
           <w:rPr>
             <w:rStyle w:val="Hyperlink"/>
@@ -2873,7 +2873,7 @@
             <w:noProof/>
             <w:webHidden/>
           </w:rPr>
-          <w:instrText xml:space="preserve"> PAGEREF _Toc241393796 \h </w:instrText>
+          <w:instrText xml:space="preserve"> PAGEREF _Toc241394123 \h </w:instrText>
         </w:r>
         <w:r>
           <w:rPr>
@@ -2914,7 +2914,7 @@
           <w:noProof/>
         </w:rPr>
       </w:pPr>
-      <w:hyperlink w:anchor="_Toc241393797" w:history="1">
+      <w:hyperlink w:anchor="_Toc241394124" w:history="1">
         <w:r>
           <w:rPr>
             <w:rStyle w:val="Hyperlink"/>
@@ -2941,7 +2941,7 @@
             <w:noProof/>
             <w:webHidden/>
           </w:rPr>
-          <w:instrText xml:space="preserve"> PAGEREF _Toc241393797 \h </w:instrText>
+          <w:instrText xml:space="preserve"> PAGEREF _Toc241394124 \h </w:instrText>
         </w:r>
         <w:r>
           <w:rPr>
@@ -2982,7 +2982,7 @@
           <w:noProof/>
         </w:rPr>
       </w:pPr>
-      <w:hyperlink w:anchor="_Toc241393798" w:history="1">
+      <w:hyperlink w:anchor="_Toc241394125" w:history="1">
         <w:r>
           <w:rPr>
             <w:rStyle w:val="Hyperlink"/>
@@ -3009,7 +3009,7 @@
             <w:noProof/>
             <w:webHidden/>
           </w:rPr>
-          <w:instrText xml:space="preserve"> PAGEREF _Toc241393798 \h </w:instrText>
+          <w:instrText xml:space="preserve"> PAGEREF _Toc241394125 \h </w:instrText>
         </w:r>
         <w:r>
           <w:rPr>
@@ -3050,7 +3050,7 @@
           <w:noProof/>
         </w:rPr>
       </w:pPr>
-      <w:hyperlink w:anchor="_Toc241393799" w:history="1">
+      <w:hyperlink w:anchor="_Toc241394126" w:history="1">
         <w:r>
           <w:rPr>
             <w:rStyle w:val="Hyperlink"/>
@@ -3077,7 +3077,7 @@
             <w:noProof/>
             <w:webHidden/>
           </w:rPr>
-          <w:instrText xml:space="preserve"> PAGEREF _Toc241393799 \h </w:instrText>
+          <w:instrText xml:space="preserve"> PAGEREF _Toc241394126 \h </w:instrText>
         </w:r>
         <w:r>
           <w:rPr>
@@ -3122,7 +3122,7 @@
       <w:pPr>
         <w:pStyle w:val="Ttulo1"/>
       </w:pPr>
-      <w:bookmarkStart w:id="0" w:name="_Toc241393757"/>
+      <w:bookmarkStart w:id="0" w:name="_Toc241394084"/>
       <w:r>
         <w:lastRenderedPageBreak/>
         <w:t>Parte 1 — Instalação</w:t>
@@ -3133,7 +3133,7 @@
       <w:pPr>
         <w:pStyle w:val="Ttulo2"/>
       </w:pPr>
-      <w:bookmarkStart w:id="1" w:name="_Toc241393758"/>
+      <w:bookmarkStart w:id="1" w:name="_Toc241394085"/>
       <w:r>
         <w:t>1.0 Antes de começar</w:t>
       </w:r>
@@ -4824,7 +4824,7 @@
       <w:pPr>
         <w:pStyle w:val="Ttulo2"/>
       </w:pPr>
-      <w:bookmarkStart w:id="2" w:name="_Toc241393759"/>
+      <w:bookmarkStart w:id="2" w:name="_Toc241394086"/>
       <w:r>
         <w:t>1.1 Criar o banco de dados</w:t>
       </w:r>
@@ -5153,7 +5153,7 @@
       <w:pPr>
         <w:pStyle w:val="Ttulo2"/>
       </w:pPr>
-      <w:bookmarkStart w:id="3" w:name="_Toc241393760"/>
+      <w:bookmarkStart w:id="3" w:name="_Toc241394087"/>
       <w:r>
         <w:t>1.2 Criar o e-mail da loja</w:t>
       </w:r>
@@ -5439,7 +5439,7 @@
       <w:pPr>
         <w:pStyle w:val="Ttulo2"/>
       </w:pPr>
-      <w:bookmarkStart w:id="4" w:name="_Toc241393761"/>
+      <w:bookmarkStart w:id="4" w:name="_Toc241394088"/>
       <w:r>
         <w:t>1.3 Escolher a versão do PHP</w:t>
       </w:r>
@@ -5729,7 +5729,7 @@
       <w:pPr>
         <w:pStyle w:val="Ttulo2"/>
       </w:pPr>
-      <w:bookmarkStart w:id="5" w:name="_Toc241393762"/>
+      <w:bookmarkStart w:id="5" w:name="_Toc241394089"/>
       <w:r>
         <w:t xml:space="preserve">1.4 Enviar e extrair o pacote no </w:t>
       </w:r>
@@ -6435,7 +6435,7 @@
       <w:pPr>
         <w:pStyle w:val="Ttulo2"/>
       </w:pPr>
-      <w:bookmarkStart w:id="6" w:name="_Toc241393763"/>
+      <w:bookmarkStart w:id="6" w:name="_Toc241394090"/>
       <w:r>
         <w:t>1.5 Ativar o HTTPS (cadeado)</w:t>
       </w:r>
@@ -6566,7 +6566,7 @@
       <w:pPr>
         <w:pStyle w:val="Ttulo2"/>
       </w:pPr>
-      <w:bookmarkStart w:id="7" w:name="_Toc241393764"/>
+      <w:bookmarkStart w:id="7" w:name="_Toc241394091"/>
       <w:r>
         <w:t>1.6 Conferir a proteção</w:t>
       </w:r>
@@ -6988,7 +6988,7 @@
       <w:pPr>
         <w:pStyle w:val="Ttulo2"/>
       </w:pPr>
-      <w:bookmarkStart w:id="8" w:name="_Toc241393765"/>
+      <w:bookmarkStart w:id="8" w:name="_Toc241394092"/>
       <w:r>
         <w:t>1.7 Instalar pelo assistente</w:t>
       </w:r>
@@ -7589,7 +7589,7 @@
         <w:rPr>
           <w:sz w:val="20"/>
         </w:rPr>
-        <w:t xml:space="preserve"> Com a caixa marcada, o assistente cria 34 produtos com fotos, 31 categorias, 16 clientes e 29 pedidos em todas as etapas (pagamento, produção, envio, entregues e cancelados). Nenhum e-mail é enviado a esses clientes fictícios. Serve para conhecer cada tela com dados de exemplo. Quando for cadastrar os seus produtos, apague tudo em </w:t>
+        <w:t xml:space="preserve"> Com a caixa marcada, o assistente cria 34 produtos com fotos, 32 categorias (7 principais e 25 subcategorias), 16 clientes e 29 pedidos em todas as etapas (pagamento, produção, envio, entregues e cancelados). Nenhum e-mail é enviado a esses clientes fictícios. Serve para conhecer cada tela com dados de exemplo. Quando for cadastrar os seus produtos, apague tudo em </w:t>
       </w:r>
       <w:r>
         <w:rPr>
@@ -7926,7 +7926,7 @@
       <w:pPr>
         <w:pStyle w:val="Ttulo2"/>
       </w:pPr>
-      <w:bookmarkStart w:id="9" w:name="_Toc241393766"/>
+      <w:bookmarkStart w:id="9" w:name="_Toc241394093"/>
       <w:r>
         <w:t>1.8 Primeiro acesso ao painel</w:t>
       </w:r>
@@ -8272,7 +8272,7 @@
       <w:pPr>
         <w:pStyle w:val="Ttulo2"/>
       </w:pPr>
-      <w:bookmarkStart w:id="10" w:name="_Toc241393767"/>
+      <w:bookmarkStart w:id="10" w:name="_Toc241394094"/>
       <w:r>
         <w:t xml:space="preserve">1.9 Apontar o domínio para </w:t>
       </w:r>
@@ -8645,7 +8645,7 @@
       <w:pPr>
         <w:pStyle w:val="Ttulo2"/>
       </w:pPr>
-      <w:bookmarkStart w:id="11" w:name="_Toc241393768"/>
+      <w:bookmarkStart w:id="11" w:name="_Toc241394095"/>
       <w:r>
         <w:t xml:space="preserve">1.10 Completar a configuração (arquivo </w:t>
       </w:r>
@@ -9502,7 +9502,7 @@
       <w:pPr>
         <w:pStyle w:val="Ttulo2"/>
       </w:pPr>
-      <w:bookmarkStart w:id="12" w:name="_Toc241393769"/>
+      <w:bookmarkStart w:id="12" w:name="_Toc241394096"/>
       <w:r>
         <w:t>1.11 Ligar as tarefas automáticas</w:t>
       </w:r>
@@ -9867,7 +9867,7 @@
       <w:pPr>
         <w:pStyle w:val="Ttulo2"/>
       </w:pPr>
-      <w:bookmarkStart w:id="13" w:name="_Toc241393770"/>
+      <w:bookmarkStart w:id="13" w:name="_Toc241394097"/>
       <w:r>
         <w:t>1.12 Conectar o Mercado Pago</w:t>
       </w:r>
@@ -10212,7 +10212,7 @@
       <w:pPr>
         <w:pStyle w:val="Ttulo2"/>
       </w:pPr>
-      <w:bookmarkStart w:id="14" w:name="_Toc241393771"/>
+      <w:bookmarkStart w:id="14" w:name="_Toc241394098"/>
       <w:r>
         <w:lastRenderedPageBreak/>
         <w:t>1.13 Ajustar a tabela de frete</w:t>
@@ -10802,7 +10802,7 @@
       <w:pPr>
         <w:pStyle w:val="Ttulo2"/>
       </w:pPr>
-      <w:bookmarkStart w:id="15" w:name="_Toc241393772"/>
+      <w:bookmarkStart w:id="15" w:name="_Toc241394099"/>
       <w:r>
         <w:t>1.14 Monitoramento (recomendado)</w:t>
       </w:r>
@@ -10947,7 +10947,7 @@
       <w:pPr>
         <w:pStyle w:val="Ttulo2"/>
       </w:pPr>
-      <w:bookmarkStart w:id="16" w:name="_Toc241393773"/>
+      <w:bookmarkStart w:id="16" w:name="_Toc241394100"/>
       <w:r>
         <w:t>1.15 Compra de teste</w:t>
       </w:r>
@@ -11313,7 +11313,7 @@
       <w:pPr>
         <w:pStyle w:val="Ttulo2"/>
       </w:pPr>
-      <w:bookmarkStart w:id="17" w:name="_Toc241393774"/>
+      <w:bookmarkStart w:id="17" w:name="_Toc241394101"/>
       <w:r>
         <w:t>1.16 Checklist final: loja pronta para vender</w:t>
       </w:r>
@@ -11761,7 +11761,7 @@
       <w:pPr>
         <w:pStyle w:val="Ttulo1"/>
       </w:pPr>
-      <w:bookmarkStart w:id="18" w:name="_Toc241393775"/>
+      <w:bookmarkStart w:id="18" w:name="_Toc241394102"/>
       <w:r>
         <w:lastRenderedPageBreak/>
         <w:t>Parte 2 — Uso do sistema</w:t>
@@ -11772,7 +11772,7 @@
       <w:pPr>
         <w:pStyle w:val="Ttulo2"/>
       </w:pPr>
-      <w:bookmarkStart w:id="19" w:name="_Toc241393776"/>
+      <w:bookmarkStart w:id="19" w:name="_Toc241394103"/>
       <w:r>
         <w:t>2.0 Quem faz o quê</w:t>
       </w:r>
@@ -12115,7 +12115,7 @@
       <w:pPr>
         <w:pStyle w:val="Ttulo2"/>
       </w:pPr>
-      <w:bookmarkStart w:id="20" w:name="_Toc241393777"/>
+      <w:bookmarkStart w:id="20" w:name="_Toc241394104"/>
       <w:r>
         <w:t>2.1 Primeiro dia (proprietário)</w:t>
       </w:r>
@@ -12432,7 +12432,7 @@
       <w:pPr>
         <w:pStyle w:val="Ttulo2"/>
       </w:pPr>
-      <w:bookmarkStart w:id="21" w:name="_Toc241393778"/>
+      <w:bookmarkStart w:id="21" w:name="_Toc241394105"/>
       <w:r>
         <w:t>2.2 Cadastro: a ordem que funciona</w:t>
       </w:r>
@@ -12507,7 +12507,7 @@
       <w:pPr>
         <w:pStyle w:val="Ttulo2"/>
       </w:pPr>
-      <w:bookmarkStart w:id="22" w:name="_Toc241393779"/>
+      <w:bookmarkStart w:id="22" w:name="_Toc241394106"/>
       <w:r>
         <w:t>2.3 Categorias (gestor)</w:t>
       </w:r>
@@ -12564,7 +12564,7 @@
       <w:pPr>
         <w:pStyle w:val="Ttulo2"/>
       </w:pPr>
-      <w:bookmarkStart w:id="23" w:name="_Toc241393780"/>
+      <w:bookmarkStart w:id="23" w:name="_Toc241394107"/>
       <w:r>
         <w:t>2.4 Produto (gestor)</w:t>
       </w:r>
@@ -13142,7 +13142,7 @@
       <w:pPr>
         <w:pStyle w:val="Ttulo2"/>
       </w:pPr>
-      <w:bookmarkStart w:id="24" w:name="_Toc241393781"/>
+      <w:bookmarkStart w:id="24" w:name="_Toc241394108"/>
       <w:r>
         <w:t>2.5 Variações (gestor)</w:t>
       </w:r>
@@ -13355,7 +13355,7 @@
       <w:pPr>
         <w:pStyle w:val="Ttulo2"/>
       </w:pPr>
-      <w:bookmarkStart w:id="25" w:name="_Toc241393782"/>
+      <w:bookmarkStart w:id="25" w:name="_Toc241394109"/>
       <w:r>
         <w:t>2.6 Personalização (gestor)</w:t>
       </w:r>
@@ -13789,7 +13789,7 @@
       <w:pPr>
         <w:pStyle w:val="Ttulo2"/>
       </w:pPr>
-      <w:bookmarkStart w:id="26" w:name="_Toc241393783"/>
+      <w:bookmarkStart w:id="26" w:name="_Toc241394110"/>
       <w:r>
         <w:t>2.7 Materiais e ficha de produção (gestor ou produção)</w:t>
       </w:r>
@@ -14185,7 +14185,7 @@
       <w:pPr>
         <w:pStyle w:val="Ttulo2"/>
       </w:pPr>
-      <w:bookmarkStart w:id="27" w:name="_Toc241393784"/>
+      <w:bookmarkStart w:id="27" w:name="_Toc241394111"/>
       <w:r>
         <w:t>2.8 Cupons (gestor)</w:t>
       </w:r>
@@ -14316,7 +14316,7 @@
       <w:pPr>
         <w:pStyle w:val="Ttulo2"/>
       </w:pPr>
-      <w:bookmarkStart w:id="28" w:name="_Toc241393785"/>
+      <w:bookmarkStart w:id="28" w:name="_Toc241394112"/>
       <w:r>
         <w:t>2.9 O caminho de um pedido</w:t>
       </w:r>
@@ -14543,7 +14543,7 @@
       <w:pPr>
         <w:pStyle w:val="Ttulo2"/>
       </w:pPr>
-      <w:bookmarkStart w:id="29" w:name="_Toc241393786"/>
+      <w:bookmarkStart w:id="29" w:name="_Toc241394113"/>
       <w:r>
         <w:t>2.10 Produção: a fila da oficina (produção ou gestor)</w:t>
       </w:r>
@@ -15031,7 +15031,7 @@
       <w:pPr>
         <w:pStyle w:val="Ttulo2"/>
       </w:pPr>
-      <w:bookmarkStart w:id="30" w:name="_Toc241393787"/>
+      <w:bookmarkStart w:id="30" w:name="_Toc241394114"/>
       <w:r>
         <w:t>2.11 Expedição (produção ou gestor)</w:t>
       </w:r>
@@ -15203,7 +15203,7 @@
       <w:pPr>
         <w:pStyle w:val="Ttulo2"/>
       </w:pPr>
-      <w:bookmarkStart w:id="31" w:name="_Toc241393788"/>
+      <w:bookmarkStart w:id="31" w:name="_Toc241394115"/>
       <w:r>
         <w:t>2.12 Atendimento (atendimento, gestor)</w:t>
       </w:r>
@@ -15507,7 +15507,7 @@
       <w:pPr>
         <w:pStyle w:val="Ttulo2"/>
       </w:pPr>
-      <w:bookmarkStart w:id="32" w:name="_Toc241393789"/>
+      <w:bookmarkStart w:id="32" w:name="_Toc241394116"/>
       <w:r>
         <w:t>2.13 Cancelar um pedido e estornar (gestor)</w:t>
       </w:r>
@@ -15651,7 +15651,7 @@
       <w:pPr>
         <w:pStyle w:val="Ttulo2"/>
       </w:pPr>
-      <w:bookmarkStart w:id="33" w:name="_Toc241393790"/>
+      <w:bookmarkStart w:id="33" w:name="_Toc241394117"/>
       <w:r>
         <w:t>2.14 Pedidos de dados pessoais — LGPD (proprietário)</w:t>
       </w:r>
@@ -15819,7 +15819,7 @@
       <w:pPr>
         <w:pStyle w:val="Ttulo2"/>
       </w:pPr>
-      <w:bookmarkStart w:id="34" w:name="_Toc241393791"/>
+      <w:bookmarkStart w:id="34" w:name="_Toc241394118"/>
       <w:r>
         <w:t>2.15 Senhas e acessos</w:t>
       </w:r>
@@ -15985,7 +15985,7 @@
       <w:pPr>
         <w:pStyle w:val="Ttulo2"/>
       </w:pPr>
-      <w:bookmarkStart w:id="35" w:name="_Toc241393792"/>
+      <w:bookmarkStart w:id="35" w:name="_Toc241394119"/>
       <w:r>
         <w:t>2.16 Rotinas</w:t>
       </w:r>
@@ -16689,7 +16689,7 @@
       <w:pPr>
         <w:pStyle w:val="Ttulo2"/>
       </w:pPr>
-      <w:bookmarkStart w:id="36" w:name="_Toc241393793"/>
+      <w:bookmarkStart w:id="36" w:name="_Toc241394120"/>
       <w:r>
         <w:t>2.17 Atualizar a loja (nova versão)</w:t>
       </w:r>
@@ -17123,7 +17123,7 @@
       <w:pPr>
         <w:pStyle w:val="Ttulo2"/>
       </w:pPr>
-      <w:bookmarkStart w:id="37" w:name="_Toc241393794"/>
+      <w:bookmarkStart w:id="37" w:name="_Toc241394121"/>
       <w:r>
         <w:lastRenderedPageBreak/>
         <w:t>2.18 Problemas comuns</w:t>
@@ -17844,7 +17844,7 @@
       <w:pPr>
         <w:pStyle w:val="Ttulo2"/>
       </w:pPr>
-      <w:bookmarkStart w:id="38" w:name="_Toc241393795"/>
+      <w:bookmarkStart w:id="38" w:name="_Toc241394122"/>
       <w:r>
         <w:t>2.19 Configuração em arquivo (YAML)</w:t>
       </w:r>
@@ -18094,7 +18094,7 @@
       <w:pPr>
         <w:pStyle w:val="Ttulo2"/>
       </w:pPr>
-      <w:bookmarkStart w:id="39" w:name="_Toc241393796"/>
+      <w:bookmarkStart w:id="39" w:name="_Toc241394123"/>
       <w:r>
         <w:t>2.20 Restaurar um backup (proprietário)</w:t>
       </w:r>
@@ -18374,7 +18374,7 @@
       <w:pPr>
         <w:pStyle w:val="Ttulo2"/>
       </w:pPr>
-      <w:bookmarkStart w:id="40" w:name="_Toc241393797"/>
+      <w:bookmarkStart w:id="40" w:name="_Toc241394124"/>
       <w:r>
         <w:t>2.21 Visão geral do painel</w:t>
       </w:r>
@@ -18541,7 +18541,7 @@
       <w:pPr>
         <w:pStyle w:val="Ttulo2"/>
       </w:pPr>
-      <w:bookmarkStart w:id="41" w:name="_Toc241393798"/>
+      <w:bookmarkStart w:id="41" w:name="_Toc241394125"/>
       <w:r>
         <w:lastRenderedPageBreak/>
         <w:t>2.22 Estoque (gestor ou produção)</w:t>
@@ -18802,7 +18802,7 @@
       <w:pPr>
         <w:pStyle w:val="Ttulo2"/>
       </w:pPr>
-      <w:bookmarkStart w:id="42" w:name="_Toc241393799"/>
+      <w:bookmarkStart w:id="42" w:name="_Toc241394126"/>
       <w:r>
         <w:t>2.23 Relatórios (gestor ou proprietário)</w:t>
       </w:r>
@@ -19405,31 +19405,31 @@
       </w:rPr>
     </w:lvl>
   </w:abstractNum>
-  <w:num w:numId="1" w16cid:durableId="16002440">
+  <w:num w:numId="1" w16cid:durableId="2022662952">
     <w:abstractNumId w:val="8"/>
   </w:num>
-  <w:num w:numId="2" w16cid:durableId="687561141">
+  <w:num w:numId="2" w16cid:durableId="1570505098">
     <w:abstractNumId w:val="6"/>
   </w:num>
-  <w:num w:numId="3" w16cid:durableId="1476986671">
+  <w:num w:numId="3" w16cid:durableId="1005984510">
     <w:abstractNumId w:val="5"/>
   </w:num>
-  <w:num w:numId="4" w16cid:durableId="1007630613">
+  <w:num w:numId="4" w16cid:durableId="1235386039">
     <w:abstractNumId w:val="4"/>
   </w:num>
-  <w:num w:numId="5" w16cid:durableId="1580675795">
+  <w:num w:numId="5" w16cid:durableId="1091704182">
     <w:abstractNumId w:val="7"/>
   </w:num>
-  <w:num w:numId="6" w16cid:durableId="1975986178">
+  <w:num w:numId="6" w16cid:durableId="1585332026">
     <w:abstractNumId w:val="3"/>
   </w:num>
-  <w:num w:numId="7" w16cid:durableId="229005641">
+  <w:num w:numId="7" w16cid:durableId="1409304847">
     <w:abstractNumId w:val="2"/>
   </w:num>
-  <w:num w:numId="8" w16cid:durableId="1001739872">
+  <w:num w:numId="8" w16cid:durableId="1781604284">
     <w:abstractNumId w:val="1"/>
   </w:num>
-  <w:num w:numId="9" w16cid:durableId="1644240069">
+  <w:num w:numId="9" w16cid:durableId="1996031139">
     <w:abstractNumId w:val="0"/>
   </w:num>
 </w:numbering>
@@ -30822,7 +30822,7 @@
     <w:autoRedefine/>
     <w:uiPriority w:val="39"/>
     <w:unhideWhenUsed/>
-    <w:rsid w:val="003F0B91"/>
+    <w:rsid w:val="007F059A"/>
     <w:pPr>
       <w:spacing w:after="100"/>
     </w:pPr>
@@ -30834,7 +30834,7 @@
     <w:autoRedefine/>
     <w:uiPriority w:val="39"/>
     <w:unhideWhenUsed/>
-    <w:rsid w:val="003F0B91"/>
+    <w:rsid w:val="007F059A"/>
     <w:pPr>
       <w:spacing w:after="100"/>
       <w:ind w:left="210"/>
@@ -30845,7 +30845,7 @@
     <w:basedOn w:val="Fontepargpadro"/>
     <w:uiPriority w:val="99"/>
     <w:unhideWhenUsed/>
-    <w:rsid w:val="003F0B91"/>
+    <w:rsid w:val="007F059A"/>
     <w:rPr>
       <w:color w:val="0000FF" w:themeColor="hyperlink"/>
       <w:u w:val="single"/>

</xml_diff>

<commit_message>
Etapa 14: aplicativo no celular, faixa de categorias e cache de CSS
- "Salvar no celular" para a loja e o painel: manifestos, ícones próprios, service worker
  (só CSS/JS versionados e fotos; páginas nunca guardadas), página offline e botão Instalar
  (Android/Chrome) ou instrução no iPhone
- Celular: faixa de categorias rolável presa no topo; "Explore por categoria" oculto na home
- asset() com ?v=<data do arquivo>: o navegador não mistura CSS antigo com HTML novo após atualizar
- Endereço atual compartilhado pelo Kernel (sem $_SERVER nos templates)
- Guia: 2.24 Instalar no celular e layout desconfigurado em Problemas comuns

Co-Authored-By: Claude Opus 5.5 <noreply@anthropic.com>
</commit_message>
<xml_diff>
--- a/docs/18-guia-de-instalacao-e-uso.docx
+++ b/docs/18-guia-de-instalacao-e-uso.docx
@@ -56,7 +56,7 @@
         <w:rPr>
           <w:sz w:val="23"/>
         </w:rPr>
-        <w:t>Guia passo a passo para colocar a loja G-Nesting no ar e usá-la no dia a dia. Os detalhes técnicos de cada assunto estão nos documentos citados entre parênteses; para instalar e usar, este guia basta. assistente da loja. Não precisa de Terminal, programação nem GitHub. equipe faz.</w:t>
+        <w:t>Guia passo a passo para colocar a loja G-Nesting no ar e usá-la no dia a dia. Os detalhes técnicos de cada assunto estão nos documentos citados entre parênteses; para instalar e usar, este guia basta. assistente da loja. Não precisa de Terminal, programação nem GitHub. com o que cada pessoa da equipe faz.</w:t>
       </w:r>
     </w:p>
     <w:p>
@@ -99,7 +99,7 @@
         <w:rPr>
           <w:sz w:val="23"/>
         </w:rPr>
-        <w:t xml:space="preserve"> cadastro, pedidos, produção, estoque, expedição, relatórios e rotinas, com o que cada pessoa da</w:t>
+        <w:t xml:space="preserve"> cadastro, pedidos, produção, estoque, expedição, relatórios, o aplicativo no celular e as rotinas,</w:t>
       </w:r>
     </w:p>
     <w:p/>
@@ -156,7 +156,7 @@
       <w:r>
         <w:fldChar w:fldCharType="separate"/>
       </w:r>
-      <w:hyperlink w:anchor="_Toc241394084" w:history="1">
+      <w:hyperlink w:anchor="_Toc241400819" w:history="1">
         <w:r>
           <w:rPr>
             <w:rStyle w:val="Hyperlink"/>
@@ -183,7 +183,7 @@
             <w:noProof/>
             <w:webHidden/>
           </w:rPr>
-          <w:instrText xml:space="preserve"> PAGEREF _Toc241394084 \h </w:instrText>
+          <w:instrText xml:space="preserve"> PAGEREF _Toc241400819 \h </w:instrText>
         </w:r>
         <w:r>
           <w:rPr>
@@ -224,7 +224,7 @@
           <w:noProof/>
         </w:rPr>
       </w:pPr>
-      <w:hyperlink w:anchor="_Toc241394085" w:history="1">
+      <w:hyperlink w:anchor="_Toc241400820" w:history="1">
         <w:r>
           <w:rPr>
             <w:rStyle w:val="Hyperlink"/>
@@ -251,7 +251,7 @@
             <w:noProof/>
             <w:webHidden/>
           </w:rPr>
-          <w:instrText xml:space="preserve"> PAGEREF _Toc241394085 \h </w:instrText>
+          <w:instrText xml:space="preserve"> PAGEREF _Toc241400820 \h </w:instrText>
         </w:r>
         <w:r>
           <w:rPr>
@@ -292,7 +292,7 @@
           <w:noProof/>
         </w:rPr>
       </w:pPr>
-      <w:hyperlink w:anchor="_Toc241394086" w:history="1">
+      <w:hyperlink w:anchor="_Toc241400821" w:history="1">
         <w:r>
           <w:rPr>
             <w:rStyle w:val="Hyperlink"/>
@@ -319,7 +319,7 @@
             <w:noProof/>
             <w:webHidden/>
           </w:rPr>
-          <w:instrText xml:space="preserve"> PAGEREF _Toc241394086 \h </w:instrText>
+          <w:instrText xml:space="preserve"> PAGEREF _Toc241400821 \h </w:instrText>
         </w:r>
         <w:r>
           <w:rPr>
@@ -360,7 +360,7 @@
           <w:noProof/>
         </w:rPr>
       </w:pPr>
-      <w:hyperlink w:anchor="_Toc241394087" w:history="1">
+      <w:hyperlink w:anchor="_Toc241400822" w:history="1">
         <w:r>
           <w:rPr>
             <w:rStyle w:val="Hyperlink"/>
@@ -387,7 +387,7 @@
             <w:noProof/>
             <w:webHidden/>
           </w:rPr>
-          <w:instrText xml:space="preserve"> PAGEREF _Toc241394087 \h </w:instrText>
+          <w:instrText xml:space="preserve"> PAGEREF _Toc241400822 \h </w:instrText>
         </w:r>
         <w:r>
           <w:rPr>
@@ -428,7 +428,7 @@
           <w:noProof/>
         </w:rPr>
       </w:pPr>
-      <w:hyperlink w:anchor="_Toc241394088" w:history="1">
+      <w:hyperlink w:anchor="_Toc241400823" w:history="1">
         <w:r>
           <w:rPr>
             <w:rStyle w:val="Hyperlink"/>
@@ -455,7 +455,7 @@
             <w:noProof/>
             <w:webHidden/>
           </w:rPr>
-          <w:instrText xml:space="preserve"> PAGEREF _Toc241394088 \h </w:instrText>
+          <w:instrText xml:space="preserve"> PAGEREF _Toc241400823 \h </w:instrText>
         </w:r>
         <w:r>
           <w:rPr>
@@ -496,7 +496,7 @@
           <w:noProof/>
         </w:rPr>
       </w:pPr>
-      <w:hyperlink w:anchor="_Toc241394089" w:history="1">
+      <w:hyperlink w:anchor="_Toc241400824" w:history="1">
         <w:r>
           <w:rPr>
             <w:rStyle w:val="Hyperlink"/>
@@ -531,7 +531,7 @@
             <w:noProof/>
             <w:webHidden/>
           </w:rPr>
-          <w:instrText xml:space="preserve"> PAGEREF _Toc241394089 \h </w:instrText>
+          <w:instrText xml:space="preserve"> PAGEREF _Toc241400824 \h </w:instrText>
         </w:r>
         <w:r>
           <w:rPr>
@@ -572,7 +572,7 @@
           <w:noProof/>
         </w:rPr>
       </w:pPr>
-      <w:hyperlink w:anchor="_Toc241394090" w:history="1">
+      <w:hyperlink w:anchor="_Toc241400825" w:history="1">
         <w:r>
           <w:rPr>
             <w:rStyle w:val="Hyperlink"/>
@@ -599,7 +599,7 @@
             <w:noProof/>
             <w:webHidden/>
           </w:rPr>
-          <w:instrText xml:space="preserve"> PAGEREF _Toc241394090 \h </w:instrText>
+          <w:instrText xml:space="preserve"> PAGEREF _Toc241400825 \h </w:instrText>
         </w:r>
         <w:r>
           <w:rPr>
@@ -640,7 +640,7 @@
           <w:noProof/>
         </w:rPr>
       </w:pPr>
-      <w:hyperlink w:anchor="_Toc241394091" w:history="1">
+      <w:hyperlink w:anchor="_Toc241400826" w:history="1">
         <w:r>
           <w:rPr>
             <w:rStyle w:val="Hyperlink"/>
@@ -667,7 +667,7 @@
             <w:noProof/>
             <w:webHidden/>
           </w:rPr>
-          <w:instrText xml:space="preserve"> PAGEREF _Toc241394091 \h </w:instrText>
+          <w:instrText xml:space="preserve"> PAGEREF _Toc241400826 \h </w:instrText>
         </w:r>
         <w:r>
           <w:rPr>
@@ -708,7 +708,7 @@
           <w:noProof/>
         </w:rPr>
       </w:pPr>
-      <w:hyperlink w:anchor="_Toc241394092" w:history="1">
+      <w:hyperlink w:anchor="_Toc241400827" w:history="1">
         <w:r>
           <w:rPr>
             <w:rStyle w:val="Hyperlink"/>
@@ -735,7 +735,7 @@
             <w:noProof/>
             <w:webHidden/>
           </w:rPr>
-          <w:instrText xml:space="preserve"> PAGEREF _Toc241394092 \h </w:instrText>
+          <w:instrText xml:space="preserve"> PAGEREF _Toc241400827 \h </w:instrText>
         </w:r>
         <w:r>
           <w:rPr>
@@ -776,7 +776,7 @@
           <w:noProof/>
         </w:rPr>
       </w:pPr>
-      <w:hyperlink w:anchor="_Toc241394093" w:history="1">
+      <w:hyperlink w:anchor="_Toc241400828" w:history="1">
         <w:r>
           <w:rPr>
             <w:rStyle w:val="Hyperlink"/>
@@ -803,7 +803,7 @@
             <w:noProof/>
             <w:webHidden/>
           </w:rPr>
-          <w:instrText xml:space="preserve"> PAGEREF _Toc241394093 \h </w:instrText>
+          <w:instrText xml:space="preserve"> PAGEREF _Toc241400828 \h </w:instrText>
         </w:r>
         <w:r>
           <w:rPr>
@@ -844,7 +844,7 @@
           <w:noProof/>
         </w:rPr>
       </w:pPr>
-      <w:hyperlink w:anchor="_Toc241394094" w:history="1">
+      <w:hyperlink w:anchor="_Toc241400829" w:history="1">
         <w:r>
           <w:rPr>
             <w:rStyle w:val="Hyperlink"/>
@@ -886,7 +886,7 @@
             <w:noProof/>
             <w:webHidden/>
           </w:rPr>
-          <w:instrText xml:space="preserve"> PAGEREF _Toc241394094 \h </w:instrText>
+          <w:instrText xml:space="preserve"> PAGEREF _Toc241400829 \h </w:instrText>
         </w:r>
         <w:r>
           <w:rPr>
@@ -927,7 +927,7 @@
           <w:noProof/>
         </w:rPr>
       </w:pPr>
-      <w:hyperlink w:anchor="_Toc241394095" w:history="1">
+      <w:hyperlink w:anchor="_Toc241400830" w:history="1">
         <w:r>
           <w:rPr>
             <w:rStyle w:val="Hyperlink"/>
@@ -969,7 +969,7 @@
             <w:noProof/>
             <w:webHidden/>
           </w:rPr>
-          <w:instrText xml:space="preserve"> PAGEREF _Toc241394095 \h </w:instrText>
+          <w:instrText xml:space="preserve"> PAGEREF _Toc241400830 \h </w:instrText>
         </w:r>
         <w:r>
           <w:rPr>
@@ -1010,7 +1010,7 @@
           <w:noProof/>
         </w:rPr>
       </w:pPr>
-      <w:hyperlink w:anchor="_Toc241394096" w:history="1">
+      <w:hyperlink w:anchor="_Toc241400831" w:history="1">
         <w:r>
           <w:rPr>
             <w:rStyle w:val="Hyperlink"/>
@@ -1037,7 +1037,7 @@
             <w:noProof/>
             <w:webHidden/>
           </w:rPr>
-          <w:instrText xml:space="preserve"> PAGEREF _Toc241394096 \h </w:instrText>
+          <w:instrText xml:space="preserve"> PAGEREF _Toc241400831 \h </w:instrText>
         </w:r>
         <w:r>
           <w:rPr>
@@ -1078,7 +1078,7 @@
           <w:noProof/>
         </w:rPr>
       </w:pPr>
-      <w:hyperlink w:anchor="_Toc241394097" w:history="1">
+      <w:hyperlink w:anchor="_Toc241400832" w:history="1">
         <w:r>
           <w:rPr>
             <w:rStyle w:val="Hyperlink"/>
@@ -1105,7 +1105,7 @@
             <w:noProof/>
             <w:webHidden/>
           </w:rPr>
-          <w:instrText xml:space="preserve"> PAGEREF _Toc241394097 \h </w:instrText>
+          <w:instrText xml:space="preserve"> PAGEREF _Toc241400832 \h </w:instrText>
         </w:r>
         <w:r>
           <w:rPr>
@@ -1146,7 +1146,7 @@
           <w:noProof/>
         </w:rPr>
       </w:pPr>
-      <w:hyperlink w:anchor="_Toc241394098" w:history="1">
+      <w:hyperlink w:anchor="_Toc241400833" w:history="1">
         <w:r>
           <w:rPr>
             <w:rStyle w:val="Hyperlink"/>
@@ -1173,7 +1173,7 @@
             <w:noProof/>
             <w:webHidden/>
           </w:rPr>
-          <w:instrText xml:space="preserve"> PAGEREF _Toc241394098 \h </w:instrText>
+          <w:instrText xml:space="preserve"> PAGEREF _Toc241400833 \h </w:instrText>
         </w:r>
         <w:r>
           <w:rPr>
@@ -1214,7 +1214,7 @@
           <w:noProof/>
         </w:rPr>
       </w:pPr>
-      <w:hyperlink w:anchor="_Toc241394099" w:history="1">
+      <w:hyperlink w:anchor="_Toc241400834" w:history="1">
         <w:r>
           <w:rPr>
             <w:rStyle w:val="Hyperlink"/>
@@ -1241,7 +1241,7 @@
             <w:noProof/>
             <w:webHidden/>
           </w:rPr>
-          <w:instrText xml:space="preserve"> PAGEREF _Toc241394099 \h </w:instrText>
+          <w:instrText xml:space="preserve"> PAGEREF _Toc241400834 \h </w:instrText>
         </w:r>
         <w:r>
           <w:rPr>
@@ -1282,7 +1282,7 @@
           <w:noProof/>
         </w:rPr>
       </w:pPr>
-      <w:hyperlink w:anchor="_Toc241394100" w:history="1">
+      <w:hyperlink w:anchor="_Toc241400835" w:history="1">
         <w:r>
           <w:rPr>
             <w:rStyle w:val="Hyperlink"/>
@@ -1309,7 +1309,7 @@
             <w:noProof/>
             <w:webHidden/>
           </w:rPr>
-          <w:instrText xml:space="preserve"> PAGEREF _Toc241394100 \h </w:instrText>
+          <w:instrText xml:space="preserve"> PAGEREF _Toc241400835 \h </w:instrText>
         </w:r>
         <w:r>
           <w:rPr>
@@ -1350,7 +1350,7 @@
           <w:noProof/>
         </w:rPr>
       </w:pPr>
-      <w:hyperlink w:anchor="_Toc241394101" w:history="1">
+      <w:hyperlink w:anchor="_Toc241400836" w:history="1">
         <w:r>
           <w:rPr>
             <w:rStyle w:val="Hyperlink"/>
@@ -1377,7 +1377,7 @@
             <w:noProof/>
             <w:webHidden/>
           </w:rPr>
-          <w:instrText xml:space="preserve"> PAGEREF _Toc241394101 \h </w:instrText>
+          <w:instrText xml:space="preserve"> PAGEREF _Toc241400836 \h </w:instrText>
         </w:r>
         <w:r>
           <w:rPr>
@@ -1418,7 +1418,7 @@
           <w:noProof/>
         </w:rPr>
       </w:pPr>
-      <w:hyperlink w:anchor="_Toc241394102" w:history="1">
+      <w:hyperlink w:anchor="_Toc241400837" w:history="1">
         <w:r>
           <w:rPr>
             <w:rStyle w:val="Hyperlink"/>
@@ -1445,7 +1445,7 @@
             <w:noProof/>
             <w:webHidden/>
           </w:rPr>
-          <w:instrText xml:space="preserve"> PAGEREF _Toc241394102 \h </w:instrText>
+          <w:instrText xml:space="preserve"> PAGEREF _Toc241400837 \h </w:instrText>
         </w:r>
         <w:r>
           <w:rPr>
@@ -1486,7 +1486,7 @@
           <w:noProof/>
         </w:rPr>
       </w:pPr>
-      <w:hyperlink w:anchor="_Toc241394103" w:history="1">
+      <w:hyperlink w:anchor="_Toc241400838" w:history="1">
         <w:r>
           <w:rPr>
             <w:rStyle w:val="Hyperlink"/>
@@ -1513,7 +1513,7 @@
             <w:noProof/>
             <w:webHidden/>
           </w:rPr>
-          <w:instrText xml:space="preserve"> PAGEREF _Toc241394103 \h </w:instrText>
+          <w:instrText xml:space="preserve"> PAGEREF _Toc241400838 \h </w:instrText>
         </w:r>
         <w:r>
           <w:rPr>
@@ -1554,7 +1554,7 @@
           <w:noProof/>
         </w:rPr>
       </w:pPr>
-      <w:hyperlink w:anchor="_Toc241394104" w:history="1">
+      <w:hyperlink w:anchor="_Toc241400839" w:history="1">
         <w:r>
           <w:rPr>
             <w:rStyle w:val="Hyperlink"/>
@@ -1581,7 +1581,7 @@
             <w:noProof/>
             <w:webHidden/>
           </w:rPr>
-          <w:instrText xml:space="preserve"> PAGEREF _Toc241394104 \h </w:instrText>
+          <w:instrText xml:space="preserve"> PAGEREF _Toc241400839 \h </w:instrText>
         </w:r>
         <w:r>
           <w:rPr>
@@ -1622,7 +1622,7 @@
           <w:noProof/>
         </w:rPr>
       </w:pPr>
-      <w:hyperlink w:anchor="_Toc241394105" w:history="1">
+      <w:hyperlink w:anchor="_Toc241400840" w:history="1">
         <w:r>
           <w:rPr>
             <w:rStyle w:val="Hyperlink"/>
@@ -1649,7 +1649,7 @@
             <w:noProof/>
             <w:webHidden/>
           </w:rPr>
-          <w:instrText xml:space="preserve"> PAGEREF _Toc241394105 \h </w:instrText>
+          <w:instrText xml:space="preserve"> PAGEREF _Toc241400840 \h </w:instrText>
         </w:r>
         <w:r>
           <w:rPr>
@@ -1690,7 +1690,7 @@
           <w:noProof/>
         </w:rPr>
       </w:pPr>
-      <w:hyperlink w:anchor="_Toc241394106" w:history="1">
+      <w:hyperlink w:anchor="_Toc241400841" w:history="1">
         <w:r>
           <w:rPr>
             <w:rStyle w:val="Hyperlink"/>
@@ -1717,7 +1717,7 @@
             <w:noProof/>
             <w:webHidden/>
           </w:rPr>
-          <w:instrText xml:space="preserve"> PAGEREF _Toc241394106 \h </w:instrText>
+          <w:instrText xml:space="preserve"> PAGEREF _Toc241400841 \h </w:instrText>
         </w:r>
         <w:r>
           <w:rPr>
@@ -1758,7 +1758,7 @@
           <w:noProof/>
         </w:rPr>
       </w:pPr>
-      <w:hyperlink w:anchor="_Toc241394107" w:history="1">
+      <w:hyperlink w:anchor="_Toc241400842" w:history="1">
         <w:r>
           <w:rPr>
             <w:rStyle w:val="Hyperlink"/>
@@ -1785,7 +1785,7 @@
             <w:noProof/>
             <w:webHidden/>
           </w:rPr>
-          <w:instrText xml:space="preserve"> PAGEREF _Toc241394107 \h </w:instrText>
+          <w:instrText xml:space="preserve"> PAGEREF _Toc241400842 \h </w:instrText>
         </w:r>
         <w:r>
           <w:rPr>
@@ -1826,7 +1826,7 @@
           <w:noProof/>
         </w:rPr>
       </w:pPr>
-      <w:hyperlink w:anchor="_Toc241394108" w:history="1">
+      <w:hyperlink w:anchor="_Toc241400843" w:history="1">
         <w:r>
           <w:rPr>
             <w:rStyle w:val="Hyperlink"/>
@@ -1853,7 +1853,7 @@
             <w:noProof/>
             <w:webHidden/>
           </w:rPr>
-          <w:instrText xml:space="preserve"> PAGEREF _Toc241394108 \h </w:instrText>
+          <w:instrText xml:space="preserve"> PAGEREF _Toc241400843 \h </w:instrText>
         </w:r>
         <w:r>
           <w:rPr>
@@ -1894,7 +1894,7 @@
           <w:noProof/>
         </w:rPr>
       </w:pPr>
-      <w:hyperlink w:anchor="_Toc241394109" w:history="1">
+      <w:hyperlink w:anchor="_Toc241400844" w:history="1">
         <w:r>
           <w:rPr>
             <w:rStyle w:val="Hyperlink"/>
@@ -1921,7 +1921,7 @@
             <w:noProof/>
             <w:webHidden/>
           </w:rPr>
-          <w:instrText xml:space="preserve"> PAGEREF _Toc241394109 \h </w:instrText>
+          <w:instrText xml:space="preserve"> PAGEREF _Toc241400844 \h </w:instrText>
         </w:r>
         <w:r>
           <w:rPr>
@@ -1962,7 +1962,7 @@
           <w:noProof/>
         </w:rPr>
       </w:pPr>
-      <w:hyperlink w:anchor="_Toc241394110" w:history="1">
+      <w:hyperlink w:anchor="_Toc241400845" w:history="1">
         <w:r>
           <w:rPr>
             <w:rStyle w:val="Hyperlink"/>
@@ -1989,7 +1989,7 @@
             <w:noProof/>
             <w:webHidden/>
           </w:rPr>
-          <w:instrText xml:space="preserve"> PAGEREF _Toc241394110 \h </w:instrText>
+          <w:instrText xml:space="preserve"> PAGEREF _Toc241400845 \h </w:instrText>
         </w:r>
         <w:r>
           <w:rPr>
@@ -2030,7 +2030,7 @@
           <w:noProof/>
         </w:rPr>
       </w:pPr>
-      <w:hyperlink w:anchor="_Toc241394111" w:history="1">
+      <w:hyperlink w:anchor="_Toc241400846" w:history="1">
         <w:r>
           <w:rPr>
             <w:rStyle w:val="Hyperlink"/>
@@ -2057,7 +2057,7 @@
             <w:noProof/>
             <w:webHidden/>
           </w:rPr>
-          <w:instrText xml:space="preserve"> PAGEREF _Toc241394111 \h </w:instrText>
+          <w:instrText xml:space="preserve"> PAGEREF _Toc241400846 \h </w:instrText>
         </w:r>
         <w:r>
           <w:rPr>
@@ -2098,7 +2098,7 @@
           <w:noProof/>
         </w:rPr>
       </w:pPr>
-      <w:hyperlink w:anchor="_Toc241394112" w:history="1">
+      <w:hyperlink w:anchor="_Toc241400847" w:history="1">
         <w:r>
           <w:rPr>
             <w:rStyle w:val="Hyperlink"/>
@@ -2125,7 +2125,7 @@
             <w:noProof/>
             <w:webHidden/>
           </w:rPr>
-          <w:instrText xml:space="preserve"> PAGEREF _Toc241394112 \h </w:instrText>
+          <w:instrText xml:space="preserve"> PAGEREF _Toc241400847 \h </w:instrText>
         </w:r>
         <w:r>
           <w:rPr>
@@ -2166,7 +2166,7 @@
           <w:noProof/>
         </w:rPr>
       </w:pPr>
-      <w:hyperlink w:anchor="_Toc241394113" w:history="1">
+      <w:hyperlink w:anchor="_Toc241400848" w:history="1">
         <w:r>
           <w:rPr>
             <w:rStyle w:val="Hyperlink"/>
@@ -2193,7 +2193,7 @@
             <w:noProof/>
             <w:webHidden/>
           </w:rPr>
-          <w:instrText xml:space="preserve"> PAGEREF _Toc241394113 \h </w:instrText>
+          <w:instrText xml:space="preserve"> PAGEREF _Toc241400848 \h </w:instrText>
         </w:r>
         <w:r>
           <w:rPr>
@@ -2234,7 +2234,7 @@
           <w:noProof/>
         </w:rPr>
       </w:pPr>
-      <w:hyperlink w:anchor="_Toc241394114" w:history="1">
+      <w:hyperlink w:anchor="_Toc241400849" w:history="1">
         <w:r>
           <w:rPr>
             <w:rStyle w:val="Hyperlink"/>
@@ -2261,7 +2261,7 @@
             <w:noProof/>
             <w:webHidden/>
           </w:rPr>
-          <w:instrText xml:space="preserve"> PAGEREF _Toc241394114 \h </w:instrText>
+          <w:instrText xml:space="preserve"> PAGEREF _Toc241400849 \h </w:instrText>
         </w:r>
         <w:r>
           <w:rPr>
@@ -2302,7 +2302,7 @@
           <w:noProof/>
         </w:rPr>
       </w:pPr>
-      <w:hyperlink w:anchor="_Toc241394115" w:history="1">
+      <w:hyperlink w:anchor="_Toc241400850" w:history="1">
         <w:r>
           <w:rPr>
             <w:rStyle w:val="Hyperlink"/>
@@ -2329,7 +2329,7 @@
             <w:noProof/>
             <w:webHidden/>
           </w:rPr>
-          <w:instrText xml:space="preserve"> PAGEREF _Toc241394115 \h </w:instrText>
+          <w:instrText xml:space="preserve"> PAGEREF _Toc241400850 \h </w:instrText>
         </w:r>
         <w:r>
           <w:rPr>
@@ -2370,7 +2370,7 @@
           <w:noProof/>
         </w:rPr>
       </w:pPr>
-      <w:hyperlink w:anchor="_Toc241394116" w:history="1">
+      <w:hyperlink w:anchor="_Toc241400851" w:history="1">
         <w:r>
           <w:rPr>
             <w:rStyle w:val="Hyperlink"/>
@@ -2397,7 +2397,7 @@
             <w:noProof/>
             <w:webHidden/>
           </w:rPr>
-          <w:instrText xml:space="preserve"> PAGEREF _Toc241394116 \h </w:instrText>
+          <w:instrText xml:space="preserve"> PAGEREF _Toc241400851 \h </w:instrText>
         </w:r>
         <w:r>
           <w:rPr>
@@ -2438,7 +2438,7 @@
           <w:noProof/>
         </w:rPr>
       </w:pPr>
-      <w:hyperlink w:anchor="_Toc241394117" w:history="1">
+      <w:hyperlink w:anchor="_Toc241400852" w:history="1">
         <w:r>
           <w:rPr>
             <w:rStyle w:val="Hyperlink"/>
@@ -2465,7 +2465,7 @@
             <w:noProof/>
             <w:webHidden/>
           </w:rPr>
-          <w:instrText xml:space="preserve"> PAGEREF _Toc241394117 \h </w:instrText>
+          <w:instrText xml:space="preserve"> PAGEREF _Toc241400852 \h </w:instrText>
         </w:r>
         <w:r>
           <w:rPr>
@@ -2506,7 +2506,7 @@
           <w:noProof/>
         </w:rPr>
       </w:pPr>
-      <w:hyperlink w:anchor="_Toc241394118" w:history="1">
+      <w:hyperlink w:anchor="_Toc241400853" w:history="1">
         <w:r>
           <w:rPr>
             <w:rStyle w:val="Hyperlink"/>
@@ -2533,7 +2533,7 @@
             <w:noProof/>
             <w:webHidden/>
           </w:rPr>
-          <w:instrText xml:space="preserve"> PAGEREF _Toc241394118 \h </w:instrText>
+          <w:instrText xml:space="preserve"> PAGEREF _Toc241400853 \h </w:instrText>
         </w:r>
         <w:r>
           <w:rPr>
@@ -2574,7 +2574,7 @@
           <w:noProof/>
         </w:rPr>
       </w:pPr>
-      <w:hyperlink w:anchor="_Toc241394119" w:history="1">
+      <w:hyperlink w:anchor="_Toc241400854" w:history="1">
         <w:r>
           <w:rPr>
             <w:rStyle w:val="Hyperlink"/>
@@ -2601,7 +2601,7 @@
             <w:noProof/>
             <w:webHidden/>
           </w:rPr>
-          <w:instrText xml:space="preserve"> PAGEREF _Toc241394119 \h </w:instrText>
+          <w:instrText xml:space="preserve"> PAGEREF _Toc241400854 \h </w:instrText>
         </w:r>
         <w:r>
           <w:rPr>
@@ -2642,7 +2642,7 @@
           <w:noProof/>
         </w:rPr>
       </w:pPr>
-      <w:hyperlink w:anchor="_Toc241394120" w:history="1">
+      <w:hyperlink w:anchor="_Toc241400855" w:history="1">
         <w:r>
           <w:rPr>
             <w:rStyle w:val="Hyperlink"/>
@@ -2669,7 +2669,7 @@
             <w:noProof/>
             <w:webHidden/>
           </w:rPr>
-          <w:instrText xml:space="preserve"> PAGEREF _Toc241394120 \h </w:instrText>
+          <w:instrText xml:space="preserve"> PAGEREF _Toc241400855 \h </w:instrText>
         </w:r>
         <w:r>
           <w:rPr>
@@ -2710,7 +2710,7 @@
           <w:noProof/>
         </w:rPr>
       </w:pPr>
-      <w:hyperlink w:anchor="_Toc241394121" w:history="1">
+      <w:hyperlink w:anchor="_Toc241400856" w:history="1">
         <w:r>
           <w:rPr>
             <w:rStyle w:val="Hyperlink"/>
@@ -2737,7 +2737,7 @@
             <w:noProof/>
             <w:webHidden/>
           </w:rPr>
-          <w:instrText xml:space="preserve"> PAGEREF _Toc241394121 \h </w:instrText>
+          <w:instrText xml:space="preserve"> PAGEREF _Toc241400856 \h </w:instrText>
         </w:r>
         <w:r>
           <w:rPr>
@@ -2778,7 +2778,7 @@
           <w:noProof/>
         </w:rPr>
       </w:pPr>
-      <w:hyperlink w:anchor="_Toc241394122" w:history="1">
+      <w:hyperlink w:anchor="_Toc241400857" w:history="1">
         <w:r>
           <w:rPr>
             <w:rStyle w:val="Hyperlink"/>
@@ -2805,7 +2805,7 @@
             <w:noProof/>
             <w:webHidden/>
           </w:rPr>
-          <w:instrText xml:space="preserve"> PAGEREF _Toc241394122 \h </w:instrText>
+          <w:instrText xml:space="preserve"> PAGEREF _Toc241400857 \h </w:instrText>
         </w:r>
         <w:r>
           <w:rPr>
@@ -2825,7 +2825,7 @@
             <w:noProof/>
             <w:webHidden/>
           </w:rPr>
-          <w:t>21</w:t>
+          <w:t>22</w:t>
         </w:r>
         <w:r>
           <w:rPr>
@@ -2846,7 +2846,7 @@
           <w:noProof/>
         </w:rPr>
       </w:pPr>
-      <w:hyperlink w:anchor="_Toc241394123" w:history="1">
+      <w:hyperlink w:anchor="_Toc241400858" w:history="1">
         <w:r>
           <w:rPr>
             <w:rStyle w:val="Hyperlink"/>
@@ -2873,7 +2873,7 @@
             <w:noProof/>
             <w:webHidden/>
           </w:rPr>
-          <w:instrText xml:space="preserve"> PAGEREF _Toc241394123 \h </w:instrText>
+          <w:instrText xml:space="preserve"> PAGEREF _Toc241400858 \h </w:instrText>
         </w:r>
         <w:r>
           <w:rPr>
@@ -2914,7 +2914,7 @@
           <w:noProof/>
         </w:rPr>
       </w:pPr>
-      <w:hyperlink w:anchor="_Toc241394124" w:history="1">
+      <w:hyperlink w:anchor="_Toc241400859" w:history="1">
         <w:r>
           <w:rPr>
             <w:rStyle w:val="Hyperlink"/>
@@ -2941,7 +2941,7 @@
             <w:noProof/>
             <w:webHidden/>
           </w:rPr>
-          <w:instrText xml:space="preserve"> PAGEREF _Toc241394124 \h </w:instrText>
+          <w:instrText xml:space="preserve"> PAGEREF _Toc241400859 \h </w:instrText>
         </w:r>
         <w:r>
           <w:rPr>
@@ -2982,7 +2982,7 @@
           <w:noProof/>
         </w:rPr>
       </w:pPr>
-      <w:hyperlink w:anchor="_Toc241394125" w:history="1">
+      <w:hyperlink w:anchor="_Toc241400860" w:history="1">
         <w:r>
           <w:rPr>
             <w:rStyle w:val="Hyperlink"/>
@@ -3009,7 +3009,7 @@
             <w:noProof/>
             <w:webHidden/>
           </w:rPr>
-          <w:instrText xml:space="preserve"> PAGEREF _Toc241394125 \h </w:instrText>
+          <w:instrText xml:space="preserve"> PAGEREF _Toc241400860 \h </w:instrText>
         </w:r>
         <w:r>
           <w:rPr>
@@ -3050,7 +3050,7 @@
           <w:noProof/>
         </w:rPr>
       </w:pPr>
-      <w:hyperlink w:anchor="_Toc241394126" w:history="1">
+      <w:hyperlink w:anchor="_Toc241400861" w:history="1">
         <w:r>
           <w:rPr>
             <w:rStyle w:val="Hyperlink"/>
@@ -3077,7 +3077,7 @@
             <w:noProof/>
             <w:webHidden/>
           </w:rPr>
-          <w:instrText xml:space="preserve"> PAGEREF _Toc241394126 \h </w:instrText>
+          <w:instrText xml:space="preserve"> PAGEREF _Toc241400861 \h </w:instrText>
         </w:r>
         <w:r>
           <w:rPr>
@@ -3109,6 +3109,74 @@
       </w:hyperlink>
     </w:p>
     <w:p>
+      <w:pPr>
+        <w:pStyle w:val="Sumrio2"/>
+        <w:tabs>
+          <w:tab w:val="right" w:leader="dot" w:pos="9402"/>
+        </w:tabs>
+        <w:rPr>
+          <w:noProof/>
+        </w:rPr>
+      </w:pPr>
+      <w:hyperlink w:anchor="_Toc241400862" w:history="1">
+        <w:r>
+          <w:rPr>
+            <w:rStyle w:val="Hyperlink"/>
+            <w:noProof/>
+          </w:rPr>
+          <w:t>2.24 Instalar no celular (clientes e equipe)</w:t>
+        </w:r>
+        <w:r>
+          <w:rPr>
+            <w:noProof/>
+            <w:webHidden/>
+          </w:rPr>
+          <w:tab/>
+        </w:r>
+        <w:r>
+          <w:rPr>
+            <w:noProof/>
+            <w:webHidden/>
+          </w:rPr>
+          <w:fldChar w:fldCharType="begin"/>
+        </w:r>
+        <w:r>
+          <w:rPr>
+            <w:noProof/>
+            <w:webHidden/>
+          </w:rPr>
+          <w:instrText xml:space="preserve"> PAGEREF _Toc241400862 \h </w:instrText>
+        </w:r>
+        <w:r>
+          <w:rPr>
+            <w:noProof/>
+            <w:webHidden/>
+          </w:rPr>
+        </w:r>
+        <w:r>
+          <w:rPr>
+            <w:noProof/>
+            <w:webHidden/>
+          </w:rPr>
+          <w:fldChar w:fldCharType="separate"/>
+        </w:r>
+        <w:r>
+          <w:rPr>
+            <w:noProof/>
+            <w:webHidden/>
+          </w:rPr>
+          <w:t>23</w:t>
+        </w:r>
+        <w:r>
+          <w:rPr>
+            <w:noProof/>
+            <w:webHidden/>
+          </w:rPr>
+          <w:fldChar w:fldCharType="end"/>
+        </w:r>
+      </w:hyperlink>
+    </w:p>
+    <w:p>
       <w:r>
         <w:fldChar w:fldCharType="end"/>
       </w:r>
@@ -3122,7 +3190,7 @@
       <w:pPr>
         <w:pStyle w:val="Ttulo1"/>
       </w:pPr>
-      <w:bookmarkStart w:id="0" w:name="_Toc241394084"/>
+      <w:bookmarkStart w:id="0" w:name="_Toc241400819"/>
       <w:r>
         <w:lastRenderedPageBreak/>
         <w:t>Parte 1 — Instalação</w:t>
@@ -3133,7 +3201,7 @@
       <w:pPr>
         <w:pStyle w:val="Ttulo2"/>
       </w:pPr>
-      <w:bookmarkStart w:id="1" w:name="_Toc241394085"/>
+      <w:bookmarkStart w:id="1" w:name="_Toc241400820"/>
       <w:r>
         <w:t>1.0 Antes de começar</w:t>
       </w:r>
@@ -4824,7 +4892,7 @@
       <w:pPr>
         <w:pStyle w:val="Ttulo2"/>
       </w:pPr>
-      <w:bookmarkStart w:id="2" w:name="_Toc241394086"/>
+      <w:bookmarkStart w:id="2" w:name="_Toc241400821"/>
       <w:r>
         <w:t>1.1 Criar o banco de dados</w:t>
       </w:r>
@@ -5153,7 +5221,7 @@
       <w:pPr>
         <w:pStyle w:val="Ttulo2"/>
       </w:pPr>
-      <w:bookmarkStart w:id="3" w:name="_Toc241394087"/>
+      <w:bookmarkStart w:id="3" w:name="_Toc241400822"/>
       <w:r>
         <w:t>1.2 Criar o e-mail da loja</w:t>
       </w:r>
@@ -5439,7 +5507,7 @@
       <w:pPr>
         <w:pStyle w:val="Ttulo2"/>
       </w:pPr>
-      <w:bookmarkStart w:id="4" w:name="_Toc241394088"/>
+      <w:bookmarkStart w:id="4" w:name="_Toc241400823"/>
       <w:r>
         <w:t>1.3 Escolher a versão do PHP</w:t>
       </w:r>
@@ -5729,7 +5797,7 @@
       <w:pPr>
         <w:pStyle w:val="Ttulo2"/>
       </w:pPr>
-      <w:bookmarkStart w:id="5" w:name="_Toc241394089"/>
+      <w:bookmarkStart w:id="5" w:name="_Toc241400824"/>
       <w:r>
         <w:t xml:space="preserve">1.4 Enviar e extrair o pacote no </w:t>
       </w:r>
@@ -6435,7 +6503,7 @@
       <w:pPr>
         <w:pStyle w:val="Ttulo2"/>
       </w:pPr>
-      <w:bookmarkStart w:id="6" w:name="_Toc241394090"/>
+      <w:bookmarkStart w:id="6" w:name="_Toc241400825"/>
       <w:r>
         <w:t>1.5 Ativar o HTTPS (cadeado)</w:t>
       </w:r>
@@ -6566,7 +6634,7 @@
       <w:pPr>
         <w:pStyle w:val="Ttulo2"/>
       </w:pPr>
-      <w:bookmarkStart w:id="7" w:name="_Toc241394091"/>
+      <w:bookmarkStart w:id="7" w:name="_Toc241400826"/>
       <w:r>
         <w:t>1.6 Conferir a proteção</w:t>
       </w:r>
@@ -6988,7 +7056,7 @@
       <w:pPr>
         <w:pStyle w:val="Ttulo2"/>
       </w:pPr>
-      <w:bookmarkStart w:id="8" w:name="_Toc241394092"/>
+      <w:bookmarkStart w:id="8" w:name="_Toc241400827"/>
       <w:r>
         <w:t>1.7 Instalar pelo assistente</w:t>
       </w:r>
@@ -7926,7 +7994,7 @@
       <w:pPr>
         <w:pStyle w:val="Ttulo2"/>
       </w:pPr>
-      <w:bookmarkStart w:id="9" w:name="_Toc241394093"/>
+      <w:bookmarkStart w:id="9" w:name="_Toc241400828"/>
       <w:r>
         <w:t>1.8 Primeiro acesso ao painel</w:t>
       </w:r>
@@ -8272,7 +8340,7 @@
       <w:pPr>
         <w:pStyle w:val="Ttulo2"/>
       </w:pPr>
-      <w:bookmarkStart w:id="10" w:name="_Toc241394094"/>
+      <w:bookmarkStart w:id="10" w:name="_Toc241400829"/>
       <w:r>
         <w:t xml:space="preserve">1.9 Apontar o domínio para </w:t>
       </w:r>
@@ -8645,7 +8713,7 @@
       <w:pPr>
         <w:pStyle w:val="Ttulo2"/>
       </w:pPr>
-      <w:bookmarkStart w:id="11" w:name="_Toc241394095"/>
+      <w:bookmarkStart w:id="11" w:name="_Toc241400830"/>
       <w:r>
         <w:t xml:space="preserve">1.10 Completar a configuração (arquivo </w:t>
       </w:r>
@@ -9502,7 +9570,7 @@
       <w:pPr>
         <w:pStyle w:val="Ttulo2"/>
       </w:pPr>
-      <w:bookmarkStart w:id="12" w:name="_Toc241394096"/>
+      <w:bookmarkStart w:id="12" w:name="_Toc241400831"/>
       <w:r>
         <w:t>1.11 Ligar as tarefas automáticas</w:t>
       </w:r>
@@ -9867,7 +9935,7 @@
       <w:pPr>
         <w:pStyle w:val="Ttulo2"/>
       </w:pPr>
-      <w:bookmarkStart w:id="13" w:name="_Toc241394097"/>
+      <w:bookmarkStart w:id="13" w:name="_Toc241400832"/>
       <w:r>
         <w:t>1.12 Conectar o Mercado Pago</w:t>
       </w:r>
@@ -10212,7 +10280,7 @@
       <w:pPr>
         <w:pStyle w:val="Ttulo2"/>
       </w:pPr>
-      <w:bookmarkStart w:id="14" w:name="_Toc241394098"/>
+      <w:bookmarkStart w:id="14" w:name="_Toc241400833"/>
       <w:r>
         <w:lastRenderedPageBreak/>
         <w:t>1.13 Ajustar a tabela de frete</w:t>
@@ -10802,7 +10870,7 @@
       <w:pPr>
         <w:pStyle w:val="Ttulo2"/>
       </w:pPr>
-      <w:bookmarkStart w:id="15" w:name="_Toc241394099"/>
+      <w:bookmarkStart w:id="15" w:name="_Toc241400834"/>
       <w:r>
         <w:t>1.14 Monitoramento (recomendado)</w:t>
       </w:r>
@@ -10947,7 +11015,7 @@
       <w:pPr>
         <w:pStyle w:val="Ttulo2"/>
       </w:pPr>
-      <w:bookmarkStart w:id="16" w:name="_Toc241394100"/>
+      <w:bookmarkStart w:id="16" w:name="_Toc241400835"/>
       <w:r>
         <w:t>1.15 Compra de teste</w:t>
       </w:r>
@@ -11313,7 +11381,7 @@
       <w:pPr>
         <w:pStyle w:val="Ttulo2"/>
       </w:pPr>
-      <w:bookmarkStart w:id="17" w:name="_Toc241394101"/>
+      <w:bookmarkStart w:id="17" w:name="_Toc241400836"/>
       <w:r>
         <w:t>1.16 Checklist final: loja pronta para vender</w:t>
       </w:r>
@@ -11761,7 +11829,7 @@
       <w:pPr>
         <w:pStyle w:val="Ttulo1"/>
       </w:pPr>
-      <w:bookmarkStart w:id="18" w:name="_Toc241394102"/>
+      <w:bookmarkStart w:id="18" w:name="_Toc241400837"/>
       <w:r>
         <w:lastRenderedPageBreak/>
         <w:t>Parte 2 — Uso do sistema</w:t>
@@ -11772,7 +11840,7 @@
       <w:pPr>
         <w:pStyle w:val="Ttulo2"/>
       </w:pPr>
-      <w:bookmarkStart w:id="19" w:name="_Toc241394103"/>
+      <w:bookmarkStart w:id="19" w:name="_Toc241400838"/>
       <w:r>
         <w:t>2.0 Quem faz o quê</w:t>
       </w:r>
@@ -12115,7 +12183,7 @@
       <w:pPr>
         <w:pStyle w:val="Ttulo2"/>
       </w:pPr>
-      <w:bookmarkStart w:id="20" w:name="_Toc241394104"/>
+      <w:bookmarkStart w:id="20" w:name="_Toc241400839"/>
       <w:r>
         <w:t>2.1 Primeiro dia (proprietário)</w:t>
       </w:r>
@@ -12432,7 +12500,7 @@
       <w:pPr>
         <w:pStyle w:val="Ttulo2"/>
       </w:pPr>
-      <w:bookmarkStart w:id="21" w:name="_Toc241394105"/>
+      <w:bookmarkStart w:id="21" w:name="_Toc241400840"/>
       <w:r>
         <w:t>2.2 Cadastro: a ordem que funciona</w:t>
       </w:r>
@@ -12507,7 +12575,7 @@
       <w:pPr>
         <w:pStyle w:val="Ttulo2"/>
       </w:pPr>
-      <w:bookmarkStart w:id="22" w:name="_Toc241394106"/>
+      <w:bookmarkStart w:id="22" w:name="_Toc241400841"/>
       <w:r>
         <w:t>2.3 Categorias (gestor)</w:t>
       </w:r>
@@ -12564,7 +12632,7 @@
       <w:pPr>
         <w:pStyle w:val="Ttulo2"/>
       </w:pPr>
-      <w:bookmarkStart w:id="23" w:name="_Toc241394107"/>
+      <w:bookmarkStart w:id="23" w:name="_Toc241400842"/>
       <w:r>
         <w:t>2.4 Produto (gestor)</w:t>
       </w:r>
@@ -13142,7 +13210,7 @@
       <w:pPr>
         <w:pStyle w:val="Ttulo2"/>
       </w:pPr>
-      <w:bookmarkStart w:id="24" w:name="_Toc241394108"/>
+      <w:bookmarkStart w:id="24" w:name="_Toc241400843"/>
       <w:r>
         <w:t>2.5 Variações (gestor)</w:t>
       </w:r>
@@ -13355,7 +13423,7 @@
       <w:pPr>
         <w:pStyle w:val="Ttulo2"/>
       </w:pPr>
-      <w:bookmarkStart w:id="25" w:name="_Toc241394109"/>
+      <w:bookmarkStart w:id="25" w:name="_Toc241400844"/>
       <w:r>
         <w:t>2.6 Personalização (gestor)</w:t>
       </w:r>
@@ -13789,7 +13857,7 @@
       <w:pPr>
         <w:pStyle w:val="Ttulo2"/>
       </w:pPr>
-      <w:bookmarkStart w:id="26" w:name="_Toc241394110"/>
+      <w:bookmarkStart w:id="26" w:name="_Toc241400845"/>
       <w:r>
         <w:t>2.7 Materiais e ficha de produção (gestor ou produção)</w:t>
       </w:r>
@@ -14185,7 +14253,7 @@
       <w:pPr>
         <w:pStyle w:val="Ttulo2"/>
       </w:pPr>
-      <w:bookmarkStart w:id="27" w:name="_Toc241394111"/>
+      <w:bookmarkStart w:id="27" w:name="_Toc241400846"/>
       <w:r>
         <w:t>2.8 Cupons (gestor)</w:t>
       </w:r>
@@ -14316,7 +14384,7 @@
       <w:pPr>
         <w:pStyle w:val="Ttulo2"/>
       </w:pPr>
-      <w:bookmarkStart w:id="28" w:name="_Toc241394112"/>
+      <w:bookmarkStart w:id="28" w:name="_Toc241400847"/>
       <w:r>
         <w:t>2.9 O caminho de um pedido</w:t>
       </w:r>
@@ -14543,7 +14611,7 @@
       <w:pPr>
         <w:pStyle w:val="Ttulo2"/>
       </w:pPr>
-      <w:bookmarkStart w:id="29" w:name="_Toc241394113"/>
+      <w:bookmarkStart w:id="29" w:name="_Toc241400848"/>
       <w:r>
         <w:t>2.10 Produção: a fila da oficina (produção ou gestor)</w:t>
       </w:r>
@@ -15031,7 +15099,7 @@
       <w:pPr>
         <w:pStyle w:val="Ttulo2"/>
       </w:pPr>
-      <w:bookmarkStart w:id="30" w:name="_Toc241394114"/>
+      <w:bookmarkStart w:id="30" w:name="_Toc241400849"/>
       <w:r>
         <w:t>2.11 Expedição (produção ou gestor)</w:t>
       </w:r>
@@ -15203,7 +15271,7 @@
       <w:pPr>
         <w:pStyle w:val="Ttulo2"/>
       </w:pPr>
-      <w:bookmarkStart w:id="31" w:name="_Toc241394115"/>
+      <w:bookmarkStart w:id="31" w:name="_Toc241400850"/>
       <w:r>
         <w:t>2.12 Atendimento (atendimento, gestor)</w:t>
       </w:r>
@@ -15507,7 +15575,7 @@
       <w:pPr>
         <w:pStyle w:val="Ttulo2"/>
       </w:pPr>
-      <w:bookmarkStart w:id="32" w:name="_Toc241394116"/>
+      <w:bookmarkStart w:id="32" w:name="_Toc241400851"/>
       <w:r>
         <w:t>2.13 Cancelar um pedido e estornar (gestor)</w:t>
       </w:r>
@@ -15651,7 +15719,7 @@
       <w:pPr>
         <w:pStyle w:val="Ttulo2"/>
       </w:pPr>
-      <w:bookmarkStart w:id="33" w:name="_Toc241394117"/>
+      <w:bookmarkStart w:id="33" w:name="_Toc241400852"/>
       <w:r>
         <w:t>2.14 Pedidos de dados pessoais — LGPD (proprietário)</w:t>
       </w:r>
@@ -15819,7 +15887,7 @@
       <w:pPr>
         <w:pStyle w:val="Ttulo2"/>
       </w:pPr>
-      <w:bookmarkStart w:id="34" w:name="_Toc241394118"/>
+      <w:bookmarkStart w:id="34" w:name="_Toc241400853"/>
       <w:r>
         <w:t>2.15 Senhas e acessos</w:t>
       </w:r>
@@ -15985,7 +16053,7 @@
       <w:pPr>
         <w:pStyle w:val="Ttulo2"/>
       </w:pPr>
-      <w:bookmarkStart w:id="35" w:name="_Toc241394119"/>
+      <w:bookmarkStart w:id="35" w:name="_Toc241400854"/>
       <w:r>
         <w:t>2.16 Rotinas</w:t>
       </w:r>
@@ -16689,7 +16757,7 @@
       <w:pPr>
         <w:pStyle w:val="Ttulo2"/>
       </w:pPr>
-      <w:bookmarkStart w:id="36" w:name="_Toc241394120"/>
+      <w:bookmarkStart w:id="36" w:name="_Toc241400855"/>
       <w:r>
         <w:t>2.17 Atualizar a loja (nova versão)</w:t>
       </w:r>
@@ -17123,7 +17191,7 @@
       <w:pPr>
         <w:pStyle w:val="Ttulo2"/>
       </w:pPr>
-      <w:bookmarkStart w:id="37" w:name="_Toc241394121"/>
+      <w:bookmarkStart w:id="37" w:name="_Toc241400856"/>
       <w:r>
         <w:lastRenderedPageBreak/>
         <w:t>2.18 Problemas comuns</w:t>
@@ -17834,6 +17902,56 @@
           </w:p>
         </w:tc>
       </w:tr>
+      <w:tr>
+        <w:trPr>
+          <w:cantSplit/>
+        </w:trPr>
+        <w:tc>
+          <w:tcPr>
+            <w:tcW w:w="4706" w:type="dxa"/>
+          </w:tcPr>
+          <w:p>
+            <w:pPr>
+              <w:spacing w:after="0" w:line="252" w:lineRule="auto"/>
+            </w:pPr>
+            <w:r>
+              <w:rPr>
+                <w:sz w:val="18"/>
+              </w:rPr>
+              <w:t>Layout desconfigurado depois de atualizar a loja (num navegador sim, noutro não)</w:t>
+            </w:r>
+          </w:p>
+        </w:tc>
+        <w:tc>
+          <w:tcPr>
+            <w:tcW w:w="4706" w:type="dxa"/>
+          </w:tcPr>
+          <w:p>
+            <w:pPr>
+              <w:spacing w:after="0" w:line="252" w:lineRule="auto"/>
+            </w:pPr>
+            <w:r>
+              <w:rPr>
+                <w:sz w:val="18"/>
+              </w:rPr>
+              <w:t xml:space="preserve">O navegador guardou o visual da versão anterior. Aperte </w:t>
+            </w:r>
+            <w:r>
+              <w:rPr>
+                <w:b/>
+                <w:sz w:val="18"/>
+              </w:rPr>
+              <w:t>Ctrl+F5</w:t>
+            </w:r>
+            <w:r>
+              <w:rPr>
+                <w:sz w:val="18"/>
+              </w:rPr>
+              <w:t xml:space="preserve"> uma vez (no celular: limpar o cache do navegador ou abrir numa aba anônima). Da versão de 27/09/2026 em diante, cada atualização troca o endereço dos arquivos de estilo e isso não acontece mais</w:t>
+            </w:r>
+          </w:p>
+        </w:tc>
+      </w:tr>
     </w:tbl>
     <w:p>
       <w:pPr>
@@ -17844,8 +17962,9 @@
       <w:pPr>
         <w:pStyle w:val="Ttulo2"/>
       </w:pPr>
-      <w:bookmarkStart w:id="38" w:name="_Toc241394122"/>
-      <w:r>
+      <w:bookmarkStart w:id="38" w:name="_Toc241400857"/>
+      <w:r>
+        <w:lastRenderedPageBreak/>
         <w:t>2.19 Configuração em arquivo (YAML)</w:t>
       </w:r>
       <w:bookmarkEnd w:id="38"/>
@@ -17933,7 +18052,6 @@
         <w:rPr>
           <w:color w:val="C4532D"/>
         </w:rPr>
-        <w:lastRenderedPageBreak/>
         <w:t>•</w:t>
       </w:r>
       <w:r>
@@ -18094,7 +18212,7 @@
       <w:pPr>
         <w:pStyle w:val="Ttulo2"/>
       </w:pPr>
-      <w:bookmarkStart w:id="39" w:name="_Toc241394123"/>
+      <w:bookmarkStart w:id="39" w:name="_Toc241400858"/>
       <w:r>
         <w:t>2.20 Restaurar um backup (proprietário)</w:t>
       </w:r>
@@ -18374,7 +18492,7 @@
       <w:pPr>
         <w:pStyle w:val="Ttulo2"/>
       </w:pPr>
-      <w:bookmarkStart w:id="40" w:name="_Toc241394124"/>
+      <w:bookmarkStart w:id="40" w:name="_Toc241400859"/>
       <w:r>
         <w:t>2.21 Visão geral do painel</w:t>
       </w:r>
@@ -18525,6 +18643,7 @@
     </w:p>
     <w:p>
       <w:r>
+        <w:lastRenderedPageBreak/>
         <w:t xml:space="preserve">A venda conta no dia em que foi </w:t>
       </w:r>
       <w:r>
@@ -18541,9 +18660,8 @@
       <w:pPr>
         <w:pStyle w:val="Ttulo2"/>
       </w:pPr>
-      <w:bookmarkStart w:id="41" w:name="_Toc241394125"/>
-      <w:r>
-        <w:lastRenderedPageBreak/>
+      <w:bookmarkStart w:id="41" w:name="_Toc241400860"/>
+      <w:r>
         <w:t>2.22 Estoque (gestor ou produção)</w:t>
       </w:r>
       <w:bookmarkEnd w:id="41"/>
@@ -18802,7 +18920,7 @@
       <w:pPr>
         <w:pStyle w:val="Ttulo2"/>
       </w:pPr>
-      <w:bookmarkStart w:id="42" w:name="_Toc241394126"/>
+      <w:bookmarkStart w:id="42" w:name="_Toc241400861"/>
       <w:r>
         <w:t>2.23 Relatórios (gestor ou proprietário)</w:t>
       </w:r>
@@ -19127,6 +19245,613 @@
       </w:r>
     </w:p>
     <w:p>
+      <w:pPr>
+        <w:pStyle w:val="Ttulo2"/>
+      </w:pPr>
+      <w:bookmarkStart w:id="43" w:name="_Toc241400862"/>
+      <w:r>
+        <w:t>2.24 Instalar no celular (clientes e equipe)</w:t>
+      </w:r>
+      <w:bookmarkEnd w:id="43"/>
+    </w:p>
+    <w:p>
+      <w:r>
+        <w:t xml:space="preserve">A loja e o painel podem ser </w:t>
+      </w:r>
+      <w:r>
+        <w:rPr>
+          <w:b/>
+        </w:rPr>
+        <w:t>salvos no celular como aplicativo</w:t>
+      </w:r>
+      <w:r>
+        <w:t>: um ícone na tela inicial que abre em tela cheia, sem a barra do navegador. São dois aplicativos separados, com ícones diferentes:</w:t>
+      </w:r>
+    </w:p>
+    <w:tbl>
+      <w:tblPr>
+        <w:tblW w:w="0" w:type="auto"/>
+        <w:tblBorders>
+          <w:top w:val="single" w:sz="4" w:space="0" w:color="D9D4CB"/>
+          <w:left w:val="single" w:sz="4" w:space="0" w:color="D9D4CB"/>
+          <w:bottom w:val="single" w:sz="4" w:space="0" w:color="D9D4CB"/>
+          <w:right w:val="single" w:sz="4" w:space="0" w:color="D9D4CB"/>
+          <w:insideH w:val="single" w:sz="4" w:space="0" w:color="D9D4CB"/>
+          <w:insideV w:val="single" w:sz="4" w:space="0" w:color="D9D4CB"/>
+        </w:tblBorders>
+        <w:tblCellMar>
+          <w:top w:w="60" w:type="dxa"/>
+          <w:left w:w="100" w:type="dxa"/>
+          <w:bottom w:w="60" w:type="dxa"/>
+          <w:right w:w="100" w:type="dxa"/>
+        </w:tblCellMar>
+        <w:tblLook w:val="04A0" w:firstRow="1" w:lastRow="0" w:firstColumn="1" w:lastColumn="0" w:noHBand="0" w:noVBand="1"/>
+      </w:tblPr>
+      <w:tblGrid>
+        <w:gridCol w:w="2353"/>
+        <w:gridCol w:w="2353"/>
+        <w:gridCol w:w="2353"/>
+        <w:gridCol w:w="2353"/>
+      </w:tblGrid>
+      <w:tr>
+        <w:trPr>
+          <w:cantSplit/>
+          <w:tblHeader/>
+        </w:trPr>
+        <w:tc>
+          <w:tcPr>
+            <w:tcW w:w="2353" w:type="dxa"/>
+            <w:shd w:val="clear" w:color="auto" w:fill="E8DCCB"/>
+          </w:tcPr>
+          <w:p>
+            <w:pPr>
+              <w:spacing w:after="0" w:line="252" w:lineRule="auto"/>
+            </w:pPr>
+            <w:r>
+              <w:rPr>
+                <w:b/>
+                <w:sz w:val="18"/>
+              </w:rPr>
+              <w:t>App</w:t>
+            </w:r>
+          </w:p>
+        </w:tc>
+        <w:tc>
+          <w:tcPr>
+            <w:tcW w:w="2353" w:type="dxa"/>
+            <w:shd w:val="clear" w:color="auto" w:fill="E8DCCB"/>
+          </w:tcPr>
+          <w:p>
+            <w:pPr>
+              <w:spacing w:after="0" w:line="252" w:lineRule="auto"/>
+            </w:pPr>
+            <w:r>
+              <w:rPr>
+                <w:b/>
+                <w:sz w:val="18"/>
+              </w:rPr>
+              <w:t>Ícone</w:t>
+            </w:r>
+          </w:p>
+        </w:tc>
+        <w:tc>
+          <w:tcPr>
+            <w:tcW w:w="2353" w:type="dxa"/>
+            <w:shd w:val="clear" w:color="auto" w:fill="E8DCCB"/>
+          </w:tcPr>
+          <w:p>
+            <w:pPr>
+              <w:spacing w:after="0" w:line="252" w:lineRule="auto"/>
+            </w:pPr>
+            <w:r>
+              <w:rPr>
+                <w:b/>
+                <w:sz w:val="18"/>
+              </w:rPr>
+              <w:t>Abre em</w:t>
+            </w:r>
+          </w:p>
+        </w:tc>
+        <w:tc>
+          <w:tcPr>
+            <w:tcW w:w="2353" w:type="dxa"/>
+            <w:shd w:val="clear" w:color="auto" w:fill="E8DCCB"/>
+          </w:tcPr>
+          <w:p>
+            <w:pPr>
+              <w:spacing w:after="0" w:line="252" w:lineRule="auto"/>
+            </w:pPr>
+            <w:r>
+              <w:rPr>
+                <w:b/>
+                <w:sz w:val="18"/>
+              </w:rPr>
+              <w:t>Para quem</w:t>
+            </w:r>
+          </w:p>
+        </w:tc>
+      </w:tr>
+      <w:tr>
+        <w:trPr>
+          <w:cantSplit/>
+        </w:trPr>
+        <w:tc>
+          <w:tcPr>
+            <w:tcW w:w="2353" w:type="dxa"/>
+          </w:tcPr>
+          <w:p>
+            <w:pPr>
+              <w:spacing w:after="0" w:line="252" w:lineRule="auto"/>
+            </w:pPr>
+            <w:r>
+              <w:rPr>
+                <w:b/>
+                <w:sz w:val="18"/>
+              </w:rPr>
+              <w:lastRenderedPageBreak/>
+              <w:t>G-Nesting</w:t>
+            </w:r>
+          </w:p>
+        </w:tc>
+        <w:tc>
+          <w:tcPr>
+            <w:tcW w:w="2353" w:type="dxa"/>
+          </w:tcPr>
+          <w:p>
+            <w:pPr>
+              <w:spacing w:after="0" w:line="252" w:lineRule="auto"/>
+            </w:pPr>
+            <w:r>
+              <w:rPr>
+                <w:sz w:val="18"/>
+              </w:rPr>
+              <w:t>G escuro sobre fundo claro</w:t>
+            </w:r>
+          </w:p>
+        </w:tc>
+        <w:tc>
+          <w:tcPr>
+            <w:tcW w:w="2353" w:type="dxa"/>
+          </w:tcPr>
+          <w:p>
+            <w:pPr>
+              <w:spacing w:after="0" w:line="252" w:lineRule="auto"/>
+            </w:pPr>
+            <w:r>
+              <w:rPr>
+                <w:sz w:val="18"/>
+              </w:rPr>
+              <w:t>a vitrine</w:t>
+            </w:r>
+          </w:p>
+        </w:tc>
+        <w:tc>
+          <w:tcPr>
+            <w:tcW w:w="2353" w:type="dxa"/>
+          </w:tcPr>
+          <w:p>
+            <w:pPr>
+              <w:spacing w:after="0" w:line="252" w:lineRule="auto"/>
+            </w:pPr>
+            <w:r>
+              <w:rPr>
+                <w:sz w:val="18"/>
+              </w:rPr>
+              <w:t>clientes</w:t>
+            </w:r>
+          </w:p>
+        </w:tc>
+      </w:tr>
+      <w:tr>
+        <w:trPr>
+          <w:cantSplit/>
+        </w:trPr>
+        <w:tc>
+          <w:tcPr>
+            <w:tcW w:w="2353" w:type="dxa"/>
+          </w:tcPr>
+          <w:p>
+            <w:pPr>
+              <w:spacing w:after="0" w:line="252" w:lineRule="auto"/>
+            </w:pPr>
+            <w:r>
+              <w:rPr>
+                <w:b/>
+                <w:sz w:val="18"/>
+              </w:rPr>
+              <w:t>Painel</w:t>
+            </w:r>
+          </w:p>
+        </w:tc>
+        <w:tc>
+          <w:tcPr>
+            <w:tcW w:w="2353" w:type="dxa"/>
+          </w:tcPr>
+          <w:p>
+            <w:pPr>
+              <w:spacing w:after="0" w:line="252" w:lineRule="auto"/>
+            </w:pPr>
+            <w:r>
+              <w:rPr>
+                <w:sz w:val="18"/>
+              </w:rPr>
+              <w:t>G claro sobre fundo escuro</w:t>
+            </w:r>
+          </w:p>
+        </w:tc>
+        <w:tc>
+          <w:tcPr>
+            <w:tcW w:w="2353" w:type="dxa"/>
+          </w:tcPr>
+          <w:p>
+            <w:pPr>
+              <w:spacing w:after="0" w:line="252" w:lineRule="auto"/>
+            </w:pPr>
+            <w:r>
+              <w:rPr>
+                <w:sz w:val="18"/>
+              </w:rPr>
+              <w:t>o login do painel</w:t>
+            </w:r>
+          </w:p>
+        </w:tc>
+        <w:tc>
+          <w:tcPr>
+            <w:tcW w:w="2353" w:type="dxa"/>
+          </w:tcPr>
+          <w:p>
+            <w:pPr>
+              <w:spacing w:after="0" w:line="252" w:lineRule="auto"/>
+            </w:pPr>
+            <w:r>
+              <w:rPr>
+                <w:sz w:val="18"/>
+              </w:rPr>
+              <w:t>a equipe (ótimo para a fila de produção no celular da oficina)</w:t>
+            </w:r>
+          </w:p>
+        </w:tc>
+      </w:tr>
+    </w:tbl>
+    <w:p>
+      <w:pPr>
+        <w:spacing w:after="40"/>
+      </w:pPr>
+    </w:p>
+    <w:p>
+      <w:r>
+        <w:t xml:space="preserve">Só funciona com a loja em </w:t>
+      </w:r>
+      <w:r>
+        <w:rPr>
+          <w:b/>
+        </w:rPr>
+        <w:t>https</w:t>
+      </w:r>
+      <w:r>
+        <w:t xml:space="preserve"> (passo 1.5).</w:t>
+      </w:r>
+    </w:p>
+    <w:p>
+      <w:r>
+        <w:rPr>
+          <w:b/>
+        </w:rPr>
+        <w:t>Android (Chrome, Samsung Internet, Edge):</w:t>
+      </w:r>
+    </w:p>
+    <w:p>
+      <w:pPr>
+        <w:tabs>
+          <w:tab w:val="left" w:pos="425"/>
+        </w:tabs>
+        <w:spacing w:after="60"/>
+        <w:ind w:left="425" w:hanging="340"/>
+      </w:pPr>
+      <w:r>
+        <w:rPr>
+          <w:b/>
+          <w:color w:val="A8431F"/>
+        </w:rPr>
+        <w:t>1.</w:t>
+      </w:r>
+      <w:r>
+        <w:rPr>
+          <w:b/>
+          <w:color w:val="A8431F"/>
+        </w:rPr>
+        <w:tab/>
+      </w:r>
+      <w:r>
+        <w:t xml:space="preserve">Abra a loja (ou </w:t>
+      </w:r>
+      <w:r>
+        <w:rPr>
+          <w:rFonts w:ascii="Consolas" w:eastAsia="Consolas" w:hAnsi="Consolas" w:cs="Consolas"/>
+          <w:color w:val="A8431F"/>
+          <w:sz w:val="19"/>
+        </w:rPr>
+        <w:t>/admin</w:t>
+      </w:r>
+      <w:r>
+        <w:t>, para o painel).</w:t>
+      </w:r>
+    </w:p>
+    <w:p>
+      <w:pPr>
+        <w:tabs>
+          <w:tab w:val="left" w:pos="425"/>
+        </w:tabs>
+        <w:spacing w:after="60"/>
+        <w:ind w:left="425" w:hanging="340"/>
+      </w:pPr>
+      <w:r>
+        <w:rPr>
+          <w:b/>
+          <w:color w:val="A8431F"/>
+        </w:rPr>
+        <w:t>2.</w:t>
+      </w:r>
+      <w:r>
+        <w:rPr>
+          <w:b/>
+          <w:color w:val="A8431F"/>
+        </w:rPr>
+        <w:tab/>
+      </w:r>
+      <w:r>
+        <w:t xml:space="preserve">Toque em </w:t>
+      </w:r>
+      <w:r>
+        <w:rPr>
+          <w:b/>
+        </w:rPr>
+        <w:t>Instalar o aplicativo</w:t>
+      </w:r>
+      <w:r>
+        <w:t xml:space="preserve">: fica no rodapé da loja e no menu ☰. No painel, é </w:t>
+      </w:r>
+      <w:r>
+        <w:rPr>
+          <w:b/>
+        </w:rPr>
+        <w:t>Instalar o painel no celular</w:t>
+      </w:r>
+      <w:r>
+        <w:t>, no fim do menu. O botão só aparece quando o navegador permite a instalação.</w:t>
+      </w:r>
+    </w:p>
+    <w:p>
+      <w:pPr>
+        <w:tabs>
+          <w:tab w:val="left" w:pos="425"/>
+        </w:tabs>
+        <w:spacing w:after="60"/>
+        <w:ind w:left="425" w:hanging="340"/>
+      </w:pPr>
+      <w:r>
+        <w:rPr>
+          <w:b/>
+          <w:color w:val="A8431F"/>
+        </w:rPr>
+        <w:t>3.</w:t>
+      </w:r>
+      <w:r>
+        <w:rPr>
+          <w:b/>
+          <w:color w:val="A8431F"/>
+        </w:rPr>
+        <w:tab/>
+      </w:r>
+      <w:r>
+        <w:t xml:space="preserve">Se o botão não aparecer, use o menu do navegador (⋮) → </w:t>
+      </w:r>
+      <w:r>
+        <w:rPr>
+          <w:b/>
+        </w:rPr>
+        <w:t>Instalar app</w:t>
+      </w:r>
+      <w:r>
+        <w:t xml:space="preserve"> ou </w:t>
+      </w:r>
+      <w:r>
+        <w:rPr>
+          <w:b/>
+        </w:rPr>
+        <w:t>Adicionar à tela inicial</w:t>
+      </w:r>
+      <w:r>
+        <w:t>.</w:t>
+      </w:r>
+    </w:p>
+    <w:p>
+      <w:r>
+        <w:rPr>
+          <w:b/>
+        </w:rPr>
+        <w:t>iPhone (Safari):</w:t>
+      </w:r>
+      <w:r>
+        <w:t xml:space="preserve"> toque em </w:t>
+      </w:r>
+      <w:r>
+        <w:rPr>
+          <w:b/>
+        </w:rPr>
+        <w:t>Compartilhar</w:t>
+      </w:r>
+      <w:r>
+        <w:t xml:space="preserve"> (quadrado com a seta) → </w:t>
+      </w:r>
+      <w:r>
+        <w:rPr>
+          <w:b/>
+        </w:rPr>
+        <w:t>Adicionar à Tela de Início</w:t>
+      </w:r>
+      <w:r>
+        <w:t>. A loja mostra essa instrução no rodapé quando é aberta no iPhone.</w:t>
+      </w:r>
+    </w:p>
+    <w:p>
+      <w:r>
+        <w:rPr>
+          <w:b/>
+        </w:rPr>
+        <w:t>Computador (Chrome ou Edge):</w:t>
+      </w:r>
+      <w:r>
+        <w:t xml:space="preserve"> o ícone de instalar aparece na barra de endereço.</w:t>
+      </w:r>
+    </w:p>
+    <w:p>
+      <w:r>
+        <w:t>Bom saber:</w:t>
+      </w:r>
+    </w:p>
+    <w:p>
+      <w:pPr>
+        <w:tabs>
+          <w:tab w:val="left" w:pos="425"/>
+        </w:tabs>
+        <w:spacing w:after="60"/>
+        <w:ind w:left="425" w:hanging="340"/>
+      </w:pPr>
+      <w:r>
+        <w:rPr>
+          <w:color w:val="C4532D"/>
+        </w:rPr>
+        <w:t>•</w:t>
+      </w:r>
+      <w:r>
+        <w:rPr>
+          <w:color w:val="C4532D"/>
+        </w:rPr>
+        <w:tab/>
+      </w:r>
+      <w:r>
+        <w:t>O aplicativo é a própria loja: tudo o que você muda no painel aparece nele na hora, sem publicar nada em loja de aplicativos.</w:t>
+      </w:r>
+    </w:p>
+    <w:p>
+      <w:pPr>
+        <w:tabs>
+          <w:tab w:val="left" w:pos="425"/>
+        </w:tabs>
+        <w:spacing w:after="60"/>
+        <w:ind w:left="425" w:hanging="340"/>
+      </w:pPr>
+      <w:r>
+        <w:rPr>
+          <w:color w:val="C4532D"/>
+        </w:rPr>
+        <w:t>•</w:t>
+      </w:r>
+      <w:r>
+        <w:rPr>
+          <w:color w:val="C4532D"/>
+        </w:rPr>
+        <w:tab/>
+      </w:r>
+      <w:r>
+        <w:rPr>
+          <w:b/>
+        </w:rPr>
+        <w:t>Sem internet</w:t>
+      </w:r>
+      <w:r>
+        <w:t>, aparece a página "Sem conexão". Nenhuma página com dados do cliente (conta, carrinho, pedido) fica guardada no celular.</w:t>
+      </w:r>
+    </w:p>
+    <w:p>
+      <w:pPr>
+        <w:tabs>
+          <w:tab w:val="left" w:pos="425"/>
+        </w:tabs>
+        <w:spacing w:after="60"/>
+        <w:ind w:left="425" w:hanging="340"/>
+      </w:pPr>
+      <w:r>
+        <w:rPr>
+          <w:color w:val="C4532D"/>
+        </w:rPr>
+        <w:t>•</w:t>
+      </w:r>
+      <w:r>
+        <w:rPr>
+          <w:color w:val="C4532D"/>
+        </w:rPr>
+        <w:tab/>
+      </w:r>
+      <w:r>
+        <w:t xml:space="preserve">Pressione o ícone por um instante para ver os </w:t>
+      </w:r>
+      <w:r>
+        <w:rPr>
+          <w:b/>
+        </w:rPr>
+        <w:t>atalhos</w:t>
+      </w:r>
+      <w:r>
+        <w:t xml:space="preserve">: </w:t>
+      </w:r>
+      <w:r>
+        <w:rPr>
+          <w:i/>
+        </w:rPr>
+        <w:t>Meus pedidos</w:t>
+      </w:r>
+      <w:r>
+        <w:t xml:space="preserve">, </w:t>
+      </w:r>
+      <w:r>
+        <w:rPr>
+          <w:i/>
+        </w:rPr>
+        <w:t>Carrinho</w:t>
+      </w:r>
+      <w:r>
+        <w:t xml:space="preserve"> e </w:t>
+      </w:r>
+      <w:r>
+        <w:rPr>
+          <w:i/>
+        </w:rPr>
+        <w:t>Favoritos</w:t>
+      </w:r>
+      <w:r>
+        <w:t xml:space="preserve"> na loja; </w:t>
+      </w:r>
+      <w:r>
+        <w:rPr>
+          <w:i/>
+        </w:rPr>
+        <w:t>Pedidos</w:t>
+      </w:r>
+      <w:r>
+        <w:t xml:space="preserve">, </w:t>
+      </w:r>
+      <w:r>
+        <w:rPr>
+          <w:i/>
+        </w:rPr>
+        <w:t>Fila de produção</w:t>
+      </w:r>
+      <w:r>
+        <w:t xml:space="preserve"> e </w:t>
+      </w:r>
+      <w:r>
+        <w:rPr>
+          <w:i/>
+        </w:rPr>
+        <w:t>Expedição</w:t>
+      </w:r>
+      <w:r>
+        <w:t xml:space="preserve"> no painel.</w:t>
+      </w:r>
+    </w:p>
+    <w:p>
       <w:r>
         <w:t xml:space="preserve">Referência técnica completa: </w:t>
       </w:r>
@@ -19405,31 +20130,31 @@
       </w:rPr>
     </w:lvl>
   </w:abstractNum>
-  <w:num w:numId="1" w16cid:durableId="2022662952">
+  <w:num w:numId="1" w16cid:durableId="1334843235">
     <w:abstractNumId w:val="8"/>
   </w:num>
-  <w:num w:numId="2" w16cid:durableId="1570505098">
+  <w:num w:numId="2" w16cid:durableId="120391499">
     <w:abstractNumId w:val="6"/>
   </w:num>
-  <w:num w:numId="3" w16cid:durableId="1005984510">
+  <w:num w:numId="3" w16cid:durableId="133068101">
     <w:abstractNumId w:val="5"/>
   </w:num>
-  <w:num w:numId="4" w16cid:durableId="1235386039">
+  <w:num w:numId="4" w16cid:durableId="1011486932">
     <w:abstractNumId w:val="4"/>
   </w:num>
-  <w:num w:numId="5" w16cid:durableId="1091704182">
+  <w:num w:numId="5" w16cid:durableId="1316298915">
     <w:abstractNumId w:val="7"/>
   </w:num>
-  <w:num w:numId="6" w16cid:durableId="1585332026">
+  <w:num w:numId="6" w16cid:durableId="588194269">
     <w:abstractNumId w:val="3"/>
   </w:num>
-  <w:num w:numId="7" w16cid:durableId="1409304847">
+  <w:num w:numId="7" w16cid:durableId="296909734">
     <w:abstractNumId w:val="2"/>
   </w:num>
-  <w:num w:numId="8" w16cid:durableId="1781604284">
+  <w:num w:numId="8" w16cid:durableId="879434573">
     <w:abstractNumId w:val="1"/>
   </w:num>
-  <w:num w:numId="9" w16cid:durableId="1996031139">
+  <w:num w:numId="9" w16cid:durableId="154806979">
     <w:abstractNumId w:val="0"/>
   </w:num>
 </w:numbering>
@@ -30822,7 +31547,7 @@
     <w:autoRedefine/>
     <w:uiPriority w:val="39"/>
     <w:unhideWhenUsed/>
-    <w:rsid w:val="007F059A"/>
+    <w:rsid w:val="007F1A7C"/>
     <w:pPr>
       <w:spacing w:after="100"/>
     </w:pPr>
@@ -30834,7 +31559,7 @@
     <w:autoRedefine/>
     <w:uiPriority w:val="39"/>
     <w:unhideWhenUsed/>
-    <w:rsid w:val="007F059A"/>
+    <w:rsid w:val="007F1A7C"/>
     <w:pPr>
       <w:spacing w:after="100"/>
       <w:ind w:left="210"/>
@@ -30845,7 +31570,7 @@
     <w:basedOn w:val="Fontepargpadro"/>
     <w:uiPriority w:val="99"/>
     <w:unhideWhenUsed/>
-    <w:rsid w:val="007F059A"/>
+    <w:rsid w:val="007F1A7C"/>
     <w:rPr>
       <w:color w:val="0000FF" w:themeColor="hyperlink"/>
       <w:u w:val="single"/>

</xml_diff>